<commit_message>
[LOGIC] Added additional hubs for workspace, notes, events and todos
</commit_message>
<xml_diff>
--- a/0_Documents/Pflichtenheft.docx
+++ b/0_Documents/Pflichtenheft.docx
@@ -6362,21 +6362,12 @@
         </w:rPr>
         <w:t>Desktop-</w:t>
       </w:r>
-      <w:proofErr w:type="spellStart"/>
-      <w:r>
-        <w:rPr>
-          <w:rFonts w:ascii="Arial" w:hAnsi="Arial" w:cs="Arial"/>
-          <w:i/>
-        </w:rPr>
-        <w:t>WebApp</w:t>
-      </w:r>
-      <w:proofErr w:type="spellEnd"/>
-      <w:r>
-        <w:rPr>
-          <w:rFonts w:ascii="Arial" w:hAnsi="Arial" w:cs="Arial"/>
-          <w:i/>
-        </w:rPr>
-        <w:t xml:space="preserve"> „Lumify“. </w:t>
+      <w:r>
+        <w:rPr>
+          <w:rFonts w:ascii="Arial" w:hAnsi="Arial" w:cs="Arial"/>
+          <w:i/>
+        </w:rPr>
+        <w:t xml:space="preserve">WebApp „Lumify“. </w:t>
       </w:r>
       <w:r>
         <w:rPr>
@@ -7330,6 +7321,13 @@
     </w:p>
     <w:p>
       <w:pPr>
+        <w:rPr>
+          <w:rFonts w:ascii="Arial" w:hAnsi="Arial" w:cs="Arial"/>
+        </w:rPr>
+      </w:pPr>
+    </w:p>
+    <w:p>
+      <w:pPr>
         <w:pStyle w:val="berschrift1"/>
         <w:numPr>
           <w:ilvl w:val="0"/>
@@ -7940,6 +7938,14 @@
     </w:p>
     <w:p>
       <w:pPr>
+        <w:rPr>
+          <w:rFonts w:ascii="Arial" w:hAnsi="Arial" w:cs="Arial"/>
+          <w:i/>
+        </w:rPr>
+      </w:pPr>
+    </w:p>
+    <w:p>
+      <w:pPr>
         <w:pStyle w:val="berschrift1"/>
         <w:numPr>
           <w:ilvl w:val="0"/>
@@ -8581,19 +8587,6 @@
     <w:p>
       <w:pPr>
         <w:pStyle w:val="Listenabsatz"/>
-        <w:ind w:left="426"/>
-      </w:pPr>
-    </w:p>
-    <w:p>
-      <w:pPr>
-        <w:pStyle w:val="Listenabsatz"/>
-        <w:ind w:left="426"/>
-      </w:pPr>
-    </w:p>
-    <w:p/>
-    <w:p>
-      <w:pPr>
-        <w:pStyle w:val="Listenabsatz"/>
         <w:tabs>
           <w:tab w:val="left" w:pos="426"/>
         </w:tabs>
@@ -8619,18 +8612,6 @@
         </w:rPr>
         <w:t>beigelegtem Blatt</w:t>
       </w:r>
-    </w:p>
-    <w:p>
-      <w:pPr>
-        <w:pStyle w:val="Listenabsatz"/>
-        <w:ind w:left="426"/>
-      </w:pPr>
-    </w:p>
-    <w:p>
-      <w:pPr>
-        <w:pStyle w:val="Listenabsatz"/>
-        <w:ind w:left="426"/>
-      </w:pPr>
     </w:p>
     <w:p/>
     <w:p>
@@ -8650,7 +8631,6 @@
         <w:rPr>
           <w:rFonts w:ascii="Arial" w:hAnsi="Arial" w:cs="Arial"/>
         </w:rPr>
-        <w:lastRenderedPageBreak/>
         <w:t>Features</w:t>
       </w:r>
       <w:bookmarkEnd w:id="16"/>
@@ -8836,15 +8816,6 @@
     </w:p>
     <w:p>
       <w:pPr>
-        <w:rPr>
-          <w:rFonts w:ascii="Arial" w:hAnsi="Arial" w:cs="Arial"/>
-          <w:i/>
-          <w:iCs/>
-        </w:rPr>
-      </w:pPr>
-    </w:p>
-    <w:p>
-      <w:pPr>
         <w:pStyle w:val="berschrift2"/>
         <w:numPr>
           <w:ilvl w:val="1"/>
@@ -8860,6 +8831,7 @@
         <w:rPr>
           <w:rFonts w:ascii="Arial" w:hAnsi="Arial" w:cs="Arial"/>
         </w:rPr>
+        <w:lastRenderedPageBreak/>
         <w:t>Sicherheitsanforderungen</w:t>
       </w:r>
       <w:bookmarkEnd w:id="17"/>
@@ -9094,14 +9066,6 @@
         </w:rPr>
         <w:t>Registrierung als neuer Benutzer</w:t>
       </w:r>
-      <w:r>
-        <w:rPr>
-          <w:rFonts w:ascii="Arial" w:hAnsi="Arial" w:cs="Arial"/>
-          <w:i/>
-          <w:iCs/>
-        </w:rPr>
-        <w:br/>
-      </w:r>
     </w:p>
     <w:p>
       <w:pPr>
@@ -9407,7 +9371,6 @@
           <w:i/>
           <w:iCs/>
         </w:rPr>
-        <w:lastRenderedPageBreak/>
         <w:t>Workspaces sollen als Cards dargestellt werden.</w:t>
       </w:r>
       <w:r>
@@ -9453,6 +9416,8 @@
         <w:t>Zusätzlich sollen noch die Module „Freundesliste“ und „Letzte Aktivitäten“ angezeigt werden.</w:t>
       </w:r>
     </w:p>
+    <w:p/>
+    <w:p/>
     <w:p/>
     <w:p>
       <w:pPr>
@@ -9471,6 +9436,7 @@
         <w:rPr>
           <w:rFonts w:ascii="Arial" w:hAnsi="Arial" w:cs="Arial"/>
         </w:rPr>
+        <w:lastRenderedPageBreak/>
         <w:t>Workspaces</w:t>
       </w:r>
       <w:bookmarkEnd w:id="25"/>
@@ -10126,6 +10092,9 @@
       </w:r>
     </w:p>
     <w:p/>
+    <w:p/>
+    <w:p/>
+    <w:p/>
     <w:p>
       <w:pPr>
         <w:pStyle w:val="berschrift2"/>
@@ -10671,6 +10640,24 @@
         </w:rPr>
       </w:pPr>
     </w:p>
+    <w:p>
+      <w:pPr>
+        <w:rPr>
+          <w:rFonts w:ascii="Arial" w:hAnsi="Arial" w:cs="Arial"/>
+          <w:i/>
+          <w:iCs/>
+        </w:rPr>
+      </w:pPr>
+    </w:p>
+    <w:p>
+      <w:pPr>
+        <w:rPr>
+          <w:rFonts w:ascii="Arial" w:hAnsi="Arial" w:cs="Arial"/>
+          <w:i/>
+          <w:iCs/>
+        </w:rPr>
+      </w:pPr>
+    </w:p>
     <w:p/>
     <w:p>
       <w:pPr>
@@ -11023,96 +11010,24 @@
           <w:i/>
           <w:iCs/>
         </w:rPr>
-        <w:t xml:space="preserve">Die Feature-Seite Notiz soll links eine Sidebar besitzen in der ein </w:t>
-      </w:r>
-      <w:proofErr w:type="spellStart"/>
-      <w:r>
-        <w:rPr>
-          <w:rFonts w:ascii="Arial" w:hAnsi="Arial" w:cs="Arial"/>
-          <w:i/>
-          <w:iCs/>
-        </w:rPr>
-        <w:t>Treeview</w:t>
-      </w:r>
-      <w:proofErr w:type="spellEnd"/>
-      <w:r>
-        <w:rPr>
-          <w:rFonts w:ascii="Arial" w:hAnsi="Arial" w:cs="Arial"/>
-          <w:i/>
-          <w:iCs/>
-        </w:rPr>
-        <w:t xml:space="preserve"> der Ordnerstruktur angezeigt wird. Elemente im </w:t>
-      </w:r>
-      <w:proofErr w:type="spellStart"/>
-      <w:r>
-        <w:rPr>
-          <w:rFonts w:ascii="Arial" w:hAnsi="Arial" w:cs="Arial"/>
-          <w:i/>
-          <w:iCs/>
-        </w:rPr>
-        <w:t>Treeview</w:t>
-      </w:r>
-      <w:proofErr w:type="spellEnd"/>
-      <w:r>
-        <w:rPr>
-          <w:rFonts w:ascii="Arial" w:hAnsi="Arial" w:cs="Arial"/>
-          <w:i/>
-          <w:iCs/>
-        </w:rPr>
-        <w:t xml:space="preserve"> sollen klickbar sein und den gewählten Ordner im Hauptfenster anzeigen. Bei Klick auf eine Notiz im </w:t>
-      </w:r>
-      <w:proofErr w:type="spellStart"/>
-      <w:r>
-        <w:rPr>
-          <w:rFonts w:ascii="Arial" w:hAnsi="Arial" w:cs="Arial"/>
-          <w:i/>
-          <w:iCs/>
-        </w:rPr>
-        <w:t>Treeview</w:t>
-      </w:r>
-      <w:proofErr w:type="spellEnd"/>
-      <w:r>
-        <w:rPr>
-          <w:rFonts w:ascii="Arial" w:hAnsi="Arial" w:cs="Arial"/>
-          <w:i/>
-          <w:iCs/>
-        </w:rPr>
-        <w:t xml:space="preserve"> soll der übergeordnete Ordner angezeigt werden.</w:t>
-      </w:r>
-    </w:p>
-    <w:p>
-      <w:pPr>
-        <w:rPr>
-          <w:rFonts w:ascii="Arial" w:hAnsi="Arial" w:cs="Arial"/>
-          <w:i/>
-          <w:iCs/>
-        </w:rPr>
-      </w:pPr>
-      <w:r>
-        <w:rPr>
-          <w:rFonts w:ascii="Arial" w:hAnsi="Arial" w:cs="Arial"/>
-          <w:i/>
-          <w:iCs/>
-        </w:rPr>
-        <w:t xml:space="preserve">Rechts neben der Sidebar soll sich der Hauptbereich mit dem </w:t>
-      </w:r>
-      <w:proofErr w:type="spellStart"/>
-      <w:r>
-        <w:rPr>
-          <w:rFonts w:ascii="Arial" w:hAnsi="Arial" w:cs="Arial"/>
-          <w:i/>
-          <w:iCs/>
-        </w:rPr>
-        <w:t>FileView</w:t>
-      </w:r>
-      <w:proofErr w:type="spellEnd"/>
-      <w:r>
-        <w:rPr>
-          <w:rFonts w:ascii="Arial" w:hAnsi="Arial" w:cs="Arial"/>
-          <w:i/>
-          <w:iCs/>
-        </w:rPr>
-        <w:t xml:space="preserve"> befinden.</w:t>
+        <w:t>Die Feature-Seite Notiz soll links eine Sidebar besitzen in der ein Treeview der Ordnerstruktur angezeigt wird. Elemente im Treeview sollen klickbar sein und den gewählten Ordner im Hauptfenster anzeigen. Bei Klick auf eine Notiz im Treeview soll der übergeordnete Ordner angezeigt werden.</w:t>
+      </w:r>
+    </w:p>
+    <w:p>
+      <w:pPr>
+        <w:rPr>
+          <w:rFonts w:ascii="Arial" w:hAnsi="Arial" w:cs="Arial"/>
+          <w:i/>
+          <w:iCs/>
+        </w:rPr>
+      </w:pPr>
+      <w:r>
+        <w:rPr>
+          <w:rFonts w:ascii="Arial" w:hAnsi="Arial" w:cs="Arial"/>
+          <w:i/>
+          <w:iCs/>
+        </w:rPr>
+        <w:t>Rechts neben der Sidebar soll sich der Hauptbereich mit dem FileView befinden.</w:t>
       </w:r>
       <w:r>
         <w:rPr>
@@ -11121,60 +11036,24 @@
           <w:iCs/>
         </w:rPr>
         <w:br/>
-        <w:t xml:space="preserve">Der </w:t>
-      </w:r>
-      <w:proofErr w:type="spellStart"/>
-      <w:r>
-        <w:rPr>
-          <w:rFonts w:ascii="Arial" w:hAnsi="Arial" w:cs="Arial"/>
-          <w:i/>
-          <w:iCs/>
-        </w:rPr>
-        <w:t>FileView</w:t>
-      </w:r>
-      <w:proofErr w:type="spellEnd"/>
-      <w:r>
-        <w:rPr>
-          <w:rFonts w:ascii="Arial" w:hAnsi="Arial" w:cs="Arial"/>
-          <w:i/>
-          <w:iCs/>
-        </w:rPr>
-        <w:t xml:space="preserve"> soll einen Header besitzen in dem der aktuelle Pfad angezeigt wird.</w:t>
-      </w:r>
-    </w:p>
-    <w:p>
-      <w:pPr>
-        <w:rPr>
-          <w:rFonts w:ascii="Arial" w:hAnsi="Arial" w:cs="Arial"/>
-          <w:i/>
-          <w:iCs/>
-        </w:rPr>
-      </w:pPr>
-      <w:r>
-        <w:rPr>
-          <w:rFonts w:ascii="Arial" w:hAnsi="Arial" w:cs="Arial"/>
-          <w:i/>
-          <w:iCs/>
-        </w:rPr>
-        <w:t xml:space="preserve">Im Content-Bereich des </w:t>
-      </w:r>
-      <w:proofErr w:type="spellStart"/>
-      <w:r>
-        <w:rPr>
-          <w:rFonts w:ascii="Arial" w:hAnsi="Arial" w:cs="Arial"/>
-          <w:i/>
-          <w:iCs/>
-        </w:rPr>
-        <w:t>FileViews</w:t>
-      </w:r>
-      <w:proofErr w:type="spellEnd"/>
-      <w:r>
-        <w:rPr>
-          <w:rFonts w:ascii="Arial" w:hAnsi="Arial" w:cs="Arial"/>
-          <w:i/>
-          <w:iCs/>
-        </w:rPr>
-        <w:t xml:space="preserve"> sollen Ordner und Notizen dargestellt werden.</w:t>
+        <w:t>Der FileView soll einen Header besitzen in dem der aktuelle Pfad angezeigt wird.</w:t>
+      </w:r>
+    </w:p>
+    <w:p>
+      <w:pPr>
+        <w:rPr>
+          <w:rFonts w:ascii="Arial" w:hAnsi="Arial" w:cs="Arial"/>
+          <w:i/>
+          <w:iCs/>
+        </w:rPr>
+      </w:pPr>
+      <w:r>
+        <w:rPr>
+          <w:rFonts w:ascii="Arial" w:hAnsi="Arial" w:cs="Arial"/>
+          <w:i/>
+          <w:iCs/>
+        </w:rPr>
+        <w:t>Im Content-Bereich des FileViews sollen Ordner und Notizen dargestellt werden.</w:t>
       </w:r>
     </w:p>
     <w:p>
@@ -11313,60 +11192,24 @@
           <w:i/>
           <w:iCs/>
         </w:rPr>
-        <w:t xml:space="preserve">ist nur </w:t>
-      </w:r>
-      <w:proofErr w:type="spellStart"/>
-      <w:r>
-        <w:rPr>
-          <w:rFonts w:ascii="Arial" w:hAnsi="Arial" w:cs="Arial"/>
-          <w:i/>
-          <w:iCs/>
-        </w:rPr>
-        <w:t>zb</w:t>
-      </w:r>
-      <w:proofErr w:type="spellEnd"/>
-      <w:r>
-        <w:rPr>
-          <w:rFonts w:ascii="Arial" w:hAnsi="Arial" w:cs="Arial"/>
-          <w:i/>
-          <w:iCs/>
-        </w:rPr>
-        <w:t>. nur aktiv, sobald ein Element gewählt ist)</w:t>
-      </w:r>
-    </w:p>
-    <w:p>
-      <w:pPr>
-        <w:rPr>
-          <w:rFonts w:ascii="Arial" w:hAnsi="Arial" w:cs="Arial"/>
-          <w:i/>
-          <w:iCs/>
-        </w:rPr>
-      </w:pPr>
-      <w:r>
-        <w:rPr>
-          <w:rFonts w:ascii="Arial" w:hAnsi="Arial" w:cs="Arial"/>
-          <w:i/>
-          <w:iCs/>
-        </w:rPr>
-        <w:t xml:space="preserve">Der </w:t>
-      </w:r>
-      <w:proofErr w:type="spellStart"/>
-      <w:r>
-        <w:rPr>
-          <w:rFonts w:ascii="Arial" w:hAnsi="Arial" w:cs="Arial"/>
-          <w:i/>
-          <w:iCs/>
-        </w:rPr>
-        <w:t>FileBrowser</w:t>
-      </w:r>
-      <w:proofErr w:type="spellEnd"/>
-      <w:r>
-        <w:rPr>
-          <w:rFonts w:ascii="Arial" w:hAnsi="Arial" w:cs="Arial"/>
-          <w:i/>
-          <w:iCs/>
-        </w:rPr>
-        <w:t xml:space="preserve"> soll intuitiv funktionieren und gewohnte Bedienung von anderen Browsern aufgreifen. Darunter ein </w:t>
+        <w:t>ist nur zb. nur aktiv, sobald ein Element gewählt ist)</w:t>
+      </w:r>
+    </w:p>
+    <w:p>
+      <w:pPr>
+        <w:rPr>
+          <w:rFonts w:ascii="Arial" w:hAnsi="Arial" w:cs="Arial"/>
+          <w:i/>
+          <w:iCs/>
+        </w:rPr>
+      </w:pPr>
+      <w:r>
+        <w:rPr>
+          <w:rFonts w:ascii="Arial" w:hAnsi="Arial" w:cs="Arial"/>
+          <w:i/>
+          <w:iCs/>
+        </w:rPr>
+        <w:t xml:space="preserve">Der FileBrowser soll intuitiv funktionieren und gewohnte Bedienung von anderen Browsern aufgreifen. Darunter ein </w:t>
       </w:r>
       <w:r>
         <w:rPr>
@@ -11400,6 +11243,15 @@
         </w:rPr>
         <w:t xml:space="preserve"> um ein Element auszuwählen.</w:t>
       </w:r>
+    </w:p>
+    <w:p>
+      <w:pPr>
+        <w:rPr>
+          <w:rFonts w:ascii="Arial" w:hAnsi="Arial" w:cs="Arial"/>
+          <w:i/>
+          <w:iCs/>
+        </w:rPr>
+      </w:pPr>
     </w:p>
     <w:p>
       <w:pPr>
@@ -11484,20 +11336,15 @@
         <w:t>Datenfluss soll immer bei der Hauptkomponente beginnen und auf Unterkomponenten verteilt werden.</w:t>
       </w:r>
     </w:p>
-    <w:p/>
-    <w:p>
-      <w:pPr>
-        <w:rPr>
-          <w:rFonts w:ascii="Arial" w:hAnsi="Arial" w:cs="Arial"/>
-          <w:sz w:val="26"/>
-          <w:szCs w:val="26"/>
-        </w:rPr>
-      </w:pPr>
-      <w:r>
-        <w:rPr>
-          <w:rFonts w:ascii="Arial" w:hAnsi="Arial" w:cs="Arial"/>
-          <w:sz w:val="26"/>
-          <w:szCs w:val="26"/>
+    <w:p>
+      <w:pPr>
+        <w:rPr>
+          <w:rFonts w:ascii="Arial" w:hAnsi="Arial" w:cs="Arial"/>
+        </w:rPr>
+      </w:pPr>
+      <w:r>
+        <w:rPr>
+          <w:rFonts w:ascii="Arial" w:hAnsi="Arial" w:cs="Arial"/>
           <w:highlight w:val="yellow"/>
         </w:rPr>
         <w:t>Mit dem folgenden Link</w:t>
@@ -11505,8 +11352,6 @@
       <w:r>
         <w:rPr>
           <w:rFonts w:ascii="Arial" w:hAnsi="Arial" w:cs="Arial"/>
-          <w:sz w:val="26"/>
-          <w:szCs w:val="26"/>
           <w:highlight w:val="yellow"/>
         </w:rPr>
         <w:t xml:space="preserve"> kann die geplante Komponenten- und Datenfluss-Struktur eingesehen werden</w:t>
@@ -11514,13 +11359,15 @@
       <w:r>
         <w:rPr>
           <w:rFonts w:ascii="Arial" w:hAnsi="Arial" w:cs="Arial"/>
-          <w:sz w:val="26"/>
-          <w:szCs w:val="26"/>
         </w:rPr>
         <w:t>:</w:t>
       </w:r>
-    </w:p>
-    <w:p>
+      <w:r>
+        <w:rPr>
+          <w:rFonts w:ascii="Arial" w:hAnsi="Arial" w:cs="Arial"/>
+        </w:rPr>
+        <w:t xml:space="preserve"> </w:t>
+      </w:r>
       <w:hyperlink r:id="rId10" w:history="1">
         <w:r>
           <w:rPr>
@@ -11578,9 +11425,7 @@
         </w:rPr>
         <w:t>Die App soll fristgerecht zum Ende des Schuljahres stabil benutzbar sein mit allen angeforderten Features.</w:t>
       </w:r>
-    </w:p>
-    <w:p>
-      <w:pPr>
+      <w:r>
         <w:rPr>
           <w:rFonts w:ascii="Arial" w:hAnsi="Arial" w:cs="Arial"/>
           <w:i/>
@@ -11588,7 +11433,8 @@
           <w:szCs w:val="21"/>
           <w:shd w:val="clear" w:color="auto" w:fill="FFFFFF"/>
         </w:rPr>
-      </w:pPr>
+        <w:br/>
+      </w:r>
     </w:p>
     <w:p>
       <w:pPr>
@@ -11987,34 +11833,14 @@
           <w:iCs/>
         </w:rPr>
       </w:pPr>
-      <w:proofErr w:type="spellStart"/>
-      <w:r>
-        <w:rPr>
-          <w:rFonts w:ascii="Arial" w:hAnsi="Arial" w:cs="Arial"/>
-          <w:i/>
-          <w:iCs/>
-        </w:rPr>
-        <w:t>Git</w:t>
-      </w:r>
-      <w:proofErr w:type="spellEnd"/>
-      <w:r>
-        <w:rPr>
-          <w:rFonts w:ascii="Arial" w:hAnsi="Arial" w:cs="Arial"/>
-          <w:i/>
-          <w:iCs/>
-        </w:rPr>
-        <w:t xml:space="preserve"> / </w:t>
-      </w:r>
-      <w:proofErr w:type="spellStart"/>
-      <w:r>
-        <w:rPr>
-          <w:rFonts w:ascii="Arial" w:hAnsi="Arial" w:cs="Arial"/>
-          <w:i/>
-          <w:iCs/>
-        </w:rPr>
-        <w:t>Github</w:t>
-      </w:r>
-      <w:proofErr w:type="spellEnd"/>
+      <w:r>
+        <w:rPr>
+          <w:rFonts w:ascii="Arial" w:hAnsi="Arial" w:cs="Arial"/>
+          <w:i/>
+          <w:iCs/>
+        </w:rPr>
+        <w:t>Git / Github</w:t>
+      </w:r>
     </w:p>
     <w:p>
       <w:pPr>
@@ -12238,7 +12064,6 @@
       </w:pPr>
       <w:bookmarkStart w:id="43" w:name="_Toc230160340"/>
       <w:r>
-        <w:lastRenderedPageBreak/>
         <w:t>6.6.</w:t>
       </w:r>
       <w:r>
@@ -12314,11 +12139,6 @@
         </w:rPr>
         <w:t>CSRF-Schutz im Backend/API</w:t>
       </w:r>
-    </w:p>
-    <w:p>
-      <w:pPr>
-        <w:ind w:left="360"/>
-      </w:pPr>
     </w:p>
     <w:p>
       <w:pPr>
@@ -12337,218 +12157,173 @@
         <w:rPr>
           <w:rFonts w:ascii="Arial" w:hAnsi="Arial" w:cs="Arial"/>
         </w:rPr>
+        <w:lastRenderedPageBreak/>
         <w:t>Problemanalyse</w:t>
       </w:r>
       <w:bookmarkEnd w:id="44"/>
     </w:p>
-    <w:tbl>
-      <w:tblPr>
-        <w:tblStyle w:val="EinfacheTabelle1"/>
-        <w:tblW w:w="0" w:type="auto"/>
-        <w:tblLook w:val="04A0" w:firstRow="1" w:lastRow="0" w:firstColumn="1" w:lastColumn="0" w:noHBand="0" w:noVBand="1"/>
-      </w:tblPr>
-      <w:tblGrid>
-        <w:gridCol w:w="2952"/>
-        <w:gridCol w:w="2845"/>
-        <w:gridCol w:w="2905"/>
-      </w:tblGrid>
-      <w:tr>
-        <w:trPr>
-          <w:cnfStyle w:val="100000000000" w:firstRow="1" w:lastRow="0" w:firstColumn="0" w:lastColumn="0" w:oddVBand="0" w:evenVBand="0" w:oddHBand="0" w:evenHBand="0" w:firstRowFirstColumn="0" w:firstRowLastColumn="0" w:lastRowFirstColumn="0" w:lastRowLastColumn="0"/>
-          <w:trHeight w:val="414"/>
-        </w:trPr>
-        <w:tc>
-          <w:tcPr>
-            <w:cnfStyle w:val="001000000000" w:firstRow="0" w:lastRow="0" w:firstColumn="1" w:lastColumn="0" w:oddVBand="0" w:evenVBand="0" w:oddHBand="0" w:evenHBand="0" w:firstRowFirstColumn="0" w:firstRowLastColumn="0" w:lastRowFirstColumn="0" w:lastRowLastColumn="0"/>
-            <w:tcW w:w="2952" w:type="dxa"/>
-          </w:tcPr>
-          <w:p>
-            <w:r>
-              <w:t>Problem</w:t>
-            </w:r>
-          </w:p>
-        </w:tc>
-        <w:tc>
-          <w:tcPr>
-            <w:tcW w:w="2845" w:type="dxa"/>
-          </w:tcPr>
-          <w:p>
-            <w:pPr>
-              <w:cnfStyle w:val="100000000000" w:firstRow="1" w:lastRow="0" w:firstColumn="0" w:lastColumn="0" w:oddVBand="0" w:evenVBand="0" w:oddHBand="0" w:evenHBand="0" w:firstRowFirstColumn="0" w:firstRowLastColumn="0" w:lastRowFirstColumn="0" w:lastRowLastColumn="0"/>
-            </w:pPr>
-            <w:r>
-              <w:t>Auswirkung</w:t>
-            </w:r>
-          </w:p>
-        </w:tc>
-        <w:tc>
-          <w:tcPr>
-            <w:tcW w:w="2905" w:type="dxa"/>
-          </w:tcPr>
-          <w:p>
-            <w:pPr>
-              <w:cnfStyle w:val="100000000000" w:firstRow="1" w:lastRow="0" w:firstColumn="0" w:lastColumn="0" w:oddVBand="0" w:evenVBand="0" w:oddHBand="0" w:evenHBand="0" w:firstRowFirstColumn="0" w:firstRowLastColumn="0" w:lastRowFirstColumn="0" w:lastRowLastColumn="0"/>
-            </w:pPr>
-            <w:r>
-              <w:t>Lösungsansatz</w:t>
-            </w:r>
-          </w:p>
-        </w:tc>
-      </w:tr>
-      <w:tr>
-        <w:trPr>
-          <w:cnfStyle w:val="000000100000" w:firstRow="0" w:lastRow="0" w:firstColumn="0" w:lastColumn="0" w:oddVBand="0" w:evenVBand="0" w:oddHBand="1" w:evenHBand="0" w:firstRowFirstColumn="0" w:firstRowLastColumn="0" w:lastRowFirstColumn="0" w:lastRowLastColumn="0"/>
-        </w:trPr>
-        <w:tc>
-          <w:tcPr>
-            <w:cnfStyle w:val="001000000000" w:firstRow="0" w:lastRow="0" w:firstColumn="1" w:lastColumn="0" w:oddVBand="0" w:evenVBand="0" w:oddHBand="0" w:evenHBand="0" w:firstRowFirstColumn="0" w:firstRowLastColumn="0" w:lastRowFirstColumn="0" w:lastRowLastColumn="0"/>
-            <w:tcW w:w="2952" w:type="dxa"/>
-          </w:tcPr>
-          <w:p>
-            <w:pPr>
-              <w:rPr>
-                <w:b w:val="0"/>
-                <w:bCs w:val="0"/>
-              </w:rPr>
-            </w:pPr>
-            <w:r>
-              <w:rPr>
-                <w:b w:val="0"/>
-                <w:bCs w:val="0"/>
-              </w:rPr>
-              <w:t>Echtzeitsynchronisation zwischen mehreren Benutzern.</w:t>
-            </w:r>
-          </w:p>
-        </w:tc>
-        <w:tc>
-          <w:tcPr>
-            <w:tcW w:w="2845" w:type="dxa"/>
-          </w:tcPr>
-          <w:p>
-            <w:pPr>
-              <w:cnfStyle w:val="000000100000" w:firstRow="0" w:lastRow="0" w:firstColumn="0" w:lastColumn="0" w:oddVBand="0" w:evenVBand="0" w:oddHBand="1" w:evenHBand="0" w:firstRowFirstColumn="0" w:firstRowLastColumn="0" w:lastRowFirstColumn="0" w:lastRowLastColumn="0"/>
-            </w:pPr>
-            <w:r>
-              <w:t>Daten könnten verzögert oder doppelt angezeigt werden. ( Nur UI )</w:t>
-            </w:r>
-          </w:p>
-        </w:tc>
-        <w:tc>
-          <w:tcPr>
-            <w:tcW w:w="2905" w:type="dxa"/>
-          </w:tcPr>
-          <w:p>
-            <w:pPr>
-              <w:cnfStyle w:val="000000100000" w:firstRow="0" w:lastRow="0" w:firstColumn="0" w:lastColumn="0" w:oddVBand="0" w:evenVBand="0" w:oddHBand="1" w:evenHBand="0" w:firstRowFirstColumn="0" w:firstRowLastColumn="0" w:lastRowFirstColumn="0" w:lastRowLastColumn="0"/>
-            </w:pPr>
-            <w:r>
-              <w:t>Prüfung des Hubsystems und Hooks auf eventuelle Abweichungen.</w:t>
-            </w:r>
-          </w:p>
-        </w:tc>
-      </w:tr>
-      <w:tr>
-        <w:tc>
-          <w:tcPr>
-            <w:cnfStyle w:val="001000000000" w:firstRow="0" w:lastRow="0" w:firstColumn="1" w:lastColumn="0" w:oddVBand="0" w:evenVBand="0" w:oddHBand="0" w:evenHBand="0" w:firstRowFirstColumn="0" w:firstRowLastColumn="0" w:lastRowFirstColumn="0" w:lastRowLastColumn="0"/>
-            <w:tcW w:w="2952" w:type="dxa"/>
-          </w:tcPr>
-          <w:p>
-            <w:pPr>
-              <w:rPr>
-                <w:b w:val="0"/>
-                <w:bCs w:val="0"/>
-              </w:rPr>
-            </w:pPr>
-            <w:r>
-              <w:rPr>
-                <w:b w:val="0"/>
-                <w:bCs w:val="0"/>
-              </w:rPr>
-              <w:t>Große Datenmengen / Viele gleichzeitige Aufrufe</w:t>
-            </w:r>
-          </w:p>
-        </w:tc>
-        <w:tc>
-          <w:tcPr>
-            <w:tcW w:w="2845" w:type="dxa"/>
-          </w:tcPr>
-          <w:p>
-            <w:pPr>
-              <w:cnfStyle w:val="000000000000" w:firstRow="0" w:lastRow="0" w:firstColumn="0" w:lastColumn="0" w:oddVBand="0" w:evenVBand="0" w:oddHBand="0" w:evenHBand="0" w:firstRowFirstColumn="0" w:firstRowLastColumn="0" w:lastRowFirstColumn="0" w:lastRowLastColumn="0"/>
-            </w:pPr>
-            <w:r>
-              <w:t>Langsame Ladezeiten</w:t>
-            </w:r>
-          </w:p>
-        </w:tc>
-        <w:tc>
-          <w:tcPr>
-            <w:tcW w:w="2905" w:type="dxa"/>
-          </w:tcPr>
-          <w:p>
-            <w:pPr>
-              <w:cnfStyle w:val="000000000000" w:firstRow="0" w:lastRow="0" w:firstColumn="0" w:lastColumn="0" w:oddVBand="0" w:evenVBand="0" w:oddHBand="0" w:evenHBand="0" w:firstRowFirstColumn="0" w:firstRowLastColumn="0" w:lastRowFirstColumn="0" w:lastRowLastColumn="0"/>
-            </w:pPr>
-            <w:r>
-              <w:t>Asynchrones Laden und Datenbankzugriffe optimieren</w:t>
-            </w:r>
-          </w:p>
-        </w:tc>
-      </w:tr>
-      <w:tr>
-        <w:trPr>
-          <w:cnfStyle w:val="000000100000" w:firstRow="0" w:lastRow="0" w:firstColumn="0" w:lastColumn="0" w:oddVBand="0" w:evenVBand="0" w:oddHBand="1" w:evenHBand="0" w:firstRowFirstColumn="0" w:firstRowLastColumn="0" w:lastRowFirstColumn="0" w:lastRowLastColumn="0"/>
-        </w:trPr>
-        <w:tc>
-          <w:tcPr>
-            <w:cnfStyle w:val="001000000000" w:firstRow="0" w:lastRow="0" w:firstColumn="1" w:lastColumn="0" w:oddVBand="0" w:evenVBand="0" w:oddHBand="0" w:evenHBand="0" w:firstRowFirstColumn="0" w:firstRowLastColumn="0" w:lastRowFirstColumn="0" w:lastRowLastColumn="0"/>
-            <w:tcW w:w="2952" w:type="dxa"/>
-          </w:tcPr>
-          <w:p>
-            <w:pPr>
-              <w:rPr>
-                <w:b w:val="0"/>
-                <w:bCs w:val="0"/>
-              </w:rPr>
-            </w:pPr>
-            <w:r>
-              <w:rPr>
-                <w:b w:val="0"/>
-                <w:bCs w:val="0"/>
-              </w:rPr>
-              <w:t>Rechteverwaltung innerhalb von Workspaces</w:t>
-            </w:r>
-          </w:p>
-        </w:tc>
-        <w:tc>
-          <w:tcPr>
-            <w:tcW w:w="2845" w:type="dxa"/>
-          </w:tcPr>
-          <w:p>
-            <w:pPr>
-              <w:cnfStyle w:val="000000100000" w:firstRow="0" w:lastRow="0" w:firstColumn="0" w:lastColumn="0" w:oddVBand="0" w:evenVBand="0" w:oddHBand="1" w:evenHBand="0" w:firstRowFirstColumn="0" w:firstRowLastColumn="0" w:lastRowFirstColumn="0" w:lastRowLastColumn="0"/>
-            </w:pPr>
-            <w:r>
-              <w:t>User könnten Zugriffe haben die ungewollt sind</w:t>
-            </w:r>
-          </w:p>
-        </w:tc>
-        <w:tc>
-          <w:tcPr>
-            <w:tcW w:w="2905" w:type="dxa"/>
-          </w:tcPr>
-          <w:p>
-            <w:pPr>
-              <w:cnfStyle w:val="000000100000" w:firstRow="0" w:lastRow="0" w:firstColumn="0" w:lastColumn="0" w:oddVBand="0" w:evenVBand="0" w:oddHBand="1" w:evenHBand="0" w:firstRowFirstColumn="0" w:firstRowLastColumn="0" w:lastRowFirstColumn="0" w:lastRowLastColumn="0"/>
-            </w:pPr>
-            <w:r>
-              <w:t>Justierung der Rechtelogik</w:t>
-            </w:r>
-          </w:p>
-        </w:tc>
-      </w:tr>
-    </w:tbl>
+    <w:p>
+      <w:pPr>
+        <w:pStyle w:val="berschrift3"/>
+        <w:numPr>
+          <w:ilvl w:val="2"/>
+          <w:numId w:val="2"/>
+        </w:numPr>
+      </w:pPr>
+      <w:r>
+        <w:t>Risikoanalyse</w:t>
+      </w:r>
+      <w:r>
+        <w:br/>
+      </w:r>
+    </w:p>
+    <w:p>
+      <w:r>
+        <w:drawing>
+          <wp:inline distT="0" distB="0" distL="0" distR="0" wp14:anchorId="59A4181B" wp14:editId="4DD1FABB">
+            <wp:extent cx="7879991" cy="3697409"/>
+            <wp:effectExtent l="0" t="4127" r="2857" b="2858"/>
+            <wp:docPr id="1170861140" name="Grafik 1"/>
+            <wp:cNvGraphicFramePr>
+              <a:graphicFrameLocks xmlns:a="http://schemas.openxmlformats.org/drawingml/2006/main" noChangeAspect="1"/>
+            </wp:cNvGraphicFramePr>
+            <a:graphic xmlns:a="http://schemas.openxmlformats.org/drawingml/2006/main">
+              <a:graphicData uri="http://schemas.openxmlformats.org/drawingml/2006/picture">
+                <pic:pic xmlns:pic="http://schemas.openxmlformats.org/drawingml/2006/picture">
+                  <pic:nvPicPr>
+                    <pic:cNvPr id="1170861140" name=""/>
+                    <pic:cNvPicPr/>
+                  </pic:nvPicPr>
+                  <pic:blipFill>
+                    <a:blip r:embed="rId11"/>
+                    <a:stretch>
+                      <a:fillRect/>
+                    </a:stretch>
+                  </pic:blipFill>
+                  <pic:spPr>
+                    <a:xfrm rot="5400000">
+                      <a:off x="0" y="0"/>
+                      <a:ext cx="7929526" cy="3720652"/>
+                    </a:xfrm>
+                    <a:prstGeom prst="rect">
+                      <a:avLst/>
+                    </a:prstGeom>
+                  </pic:spPr>
+                </pic:pic>
+              </a:graphicData>
+            </a:graphic>
+          </wp:inline>
+        </w:drawing>
+      </w:r>
+    </w:p>
+    <w:p/>
+    <w:p>
+      <w:pPr>
+        <w:pStyle w:val="berschrift3"/>
+        <w:numPr>
+          <w:ilvl w:val="2"/>
+          <w:numId w:val="2"/>
+        </w:numPr>
+      </w:pPr>
+      <w:r>
+        <w:lastRenderedPageBreak/>
+        <w:t>Risikomatrix</w:t>
+      </w:r>
+      <w:r>
+        <w:br/>
+      </w:r>
+    </w:p>
+    <w:p>
+      <w:r>
+        <w:drawing>
+          <wp:inline distT="0" distB="0" distL="0" distR="0" wp14:anchorId="5C8C0E2B" wp14:editId="457C5DDA">
+            <wp:extent cx="5760720" cy="3728720"/>
+            <wp:effectExtent l="0" t="0" r="0" b="5080"/>
+            <wp:docPr id="339406284" name="Grafik 1"/>
+            <wp:cNvGraphicFramePr>
+              <a:graphicFrameLocks xmlns:a="http://schemas.openxmlformats.org/drawingml/2006/main" noChangeAspect="1"/>
+            </wp:cNvGraphicFramePr>
+            <a:graphic xmlns:a="http://schemas.openxmlformats.org/drawingml/2006/main">
+              <a:graphicData uri="http://schemas.openxmlformats.org/drawingml/2006/picture">
+                <pic:pic xmlns:pic="http://schemas.openxmlformats.org/drawingml/2006/picture">
+                  <pic:nvPicPr>
+                    <pic:cNvPr id="339406284" name=""/>
+                    <pic:cNvPicPr/>
+                  </pic:nvPicPr>
+                  <pic:blipFill rotWithShape="1">
+                    <a:blip r:embed="rId12"/>
+                    <a:srcRect t="7556"/>
+                    <a:stretch>
+                      <a:fillRect/>
+                    </a:stretch>
+                  </pic:blipFill>
+                  <pic:spPr bwMode="auto">
+                    <a:xfrm>
+                      <a:off x="0" y="0"/>
+                      <a:ext cx="5760720" cy="3728720"/>
+                    </a:xfrm>
+                    <a:prstGeom prst="rect">
+                      <a:avLst/>
+                    </a:prstGeom>
+                    <a:ln>
+                      <a:noFill/>
+                    </a:ln>
+                    <a:extLst>
+                      <a:ext uri="{53640926-AAD7-44D8-BBD7-CCE9431645EC}">
+                        <a14:shadowObscured xmlns:a14="http://schemas.microsoft.com/office/drawing/2010/main"/>
+                      </a:ext>
+                    </a:extLst>
+                  </pic:spPr>
+                </pic:pic>
+              </a:graphicData>
+            </a:graphic>
+          </wp:inline>
+        </w:drawing>
+      </w:r>
+    </w:p>
+    <w:p/>
+    <w:p>
+      <w:r>
+        <w:drawing>
+          <wp:inline distT="0" distB="0" distL="0" distR="0" wp14:anchorId="698299F2" wp14:editId="02514FB3">
+            <wp:extent cx="5760720" cy="3460750"/>
+            <wp:effectExtent l="0" t="0" r="0" b="6350"/>
+            <wp:docPr id="1060668023" name="Grafik 1"/>
+            <wp:cNvGraphicFramePr>
+              <a:graphicFrameLocks xmlns:a="http://schemas.openxmlformats.org/drawingml/2006/main" noChangeAspect="1"/>
+            </wp:cNvGraphicFramePr>
+            <a:graphic xmlns:a="http://schemas.openxmlformats.org/drawingml/2006/main">
+              <a:graphicData uri="http://schemas.openxmlformats.org/drawingml/2006/picture">
+                <pic:pic xmlns:pic="http://schemas.openxmlformats.org/drawingml/2006/picture">
+                  <pic:nvPicPr>
+                    <pic:cNvPr id="1060668023" name=""/>
+                    <pic:cNvPicPr/>
+                  </pic:nvPicPr>
+                  <pic:blipFill>
+                    <a:blip r:embed="rId13"/>
+                    <a:stretch>
+                      <a:fillRect/>
+                    </a:stretch>
+                  </pic:blipFill>
+                  <pic:spPr>
+                    <a:xfrm>
+                      <a:off x="0" y="0"/>
+                      <a:ext cx="5760720" cy="3460750"/>
+                    </a:xfrm>
+                    <a:prstGeom prst="rect">
+                      <a:avLst/>
+                    </a:prstGeom>
+                  </pic:spPr>
+                </pic:pic>
+              </a:graphicData>
+            </a:graphic>
+          </wp:inline>
+        </w:drawing>
+      </w:r>
+    </w:p>
+    <w:p/>
+    <w:p/>
+    <w:p/>
     <w:p>
       <w:pPr>
         <w:ind w:left="360"/>
@@ -12571,6 +12346,7 @@
         <w:rPr>
           <w:rFonts w:ascii="Arial" w:hAnsi="Arial" w:cs="Arial"/>
         </w:rPr>
+        <w:lastRenderedPageBreak/>
         <w:t>Qualität</w:t>
       </w:r>
       <w:bookmarkEnd w:id="45"/>
@@ -12596,7 +12372,10 @@
       </w:pPr>
       <w:bookmarkStart w:id="46" w:name="_Toc230160343"/>
       <w:r>
-        <w:t>6.4.1 Qualitätsanforderungen:</w:t>
+        <w:t>7</w:t>
+      </w:r>
+      <w:r>
+        <w:t>.4.1 Qualitätsanforderungen:</w:t>
       </w:r>
       <w:bookmarkEnd w:id="46"/>
     </w:p>
@@ -12732,7 +12511,10 @@
       </w:pPr>
       <w:bookmarkStart w:id="47" w:name="_Toc230160344"/>
       <w:r>
-        <w:t>6.4.1 Qualitätssicherung:</w:t>
+        <w:t>7</w:t>
+      </w:r>
+      <w:r>
+        <w:t>.4.1 Qualitätssicherung:</w:t>
       </w:r>
       <w:bookmarkEnd w:id="47"/>
     </w:p>
@@ -12890,28 +12672,6 @@
     </w:p>
     <w:p>
       <w:pPr>
-        <w:rPr>
-          <w:rFonts w:ascii="Arial" w:hAnsi="Arial" w:cs="Arial"/>
-          <w:i/>
-          <w:color w:val="3C3C3C"/>
-          <w:szCs w:val="21"/>
-          <w:shd w:val="clear" w:color="auto" w:fill="FFFFFF"/>
-        </w:rPr>
-      </w:pPr>
-    </w:p>
-    <w:p>
-      <w:pPr>
-        <w:rPr>
-          <w:rFonts w:ascii="Arial" w:hAnsi="Arial" w:cs="Arial"/>
-          <w:i/>
-          <w:color w:val="3C3C3C"/>
-          <w:szCs w:val="21"/>
-          <w:shd w:val="clear" w:color="auto" w:fill="FFFFFF"/>
-        </w:rPr>
-      </w:pPr>
-    </w:p>
-    <w:p>
-      <w:pPr>
         <w:pStyle w:val="berschrift1"/>
         <w:numPr>
           <w:ilvl w:val="0"/>
@@ -12927,7 +12687,6 @@
         <w:rPr>
           <w:rFonts w:ascii="Arial" w:hAnsi="Arial" w:cs="Arial"/>
         </w:rPr>
-        <w:lastRenderedPageBreak/>
         <w:t>Beurteilung</w:t>
       </w:r>
       <w:bookmarkEnd w:id="49"/>
@@ -12942,6 +12701,16 @@
           <w:shd w:val="clear" w:color="auto" w:fill="FFFFFF"/>
         </w:rPr>
       </w:pPr>
+      <w:r>
+        <w:rPr>
+          <w:rFonts w:ascii="Arial" w:hAnsi="Arial" w:cs="Arial"/>
+          <w:i/>
+          <w:color w:val="3C3C3C"/>
+          <w:szCs w:val="21"/>
+          <w:shd w:val="clear" w:color="auto" w:fill="FFFFFF"/>
+        </w:rPr>
+        <w:t>Noch nicht beurteilt.</w:t>
+      </w:r>
     </w:p>
     <w:p>
       <w:pPr>
@@ -13028,6 +12797,70 @@
         </w:rPr>
         <w:t xml:space="preserve"> Projekt dienen.</w:t>
       </w:r>
+    </w:p>
+    <w:p>
+      <w:pPr>
+        <w:rPr>
+          <w:rFonts w:ascii="Arial" w:hAnsi="Arial" w:cs="Arial"/>
+          <w:i/>
+        </w:rPr>
+      </w:pPr>
+    </w:p>
+    <w:p>
+      <w:pPr>
+        <w:rPr>
+          <w:rFonts w:ascii="Arial" w:hAnsi="Arial" w:cs="Arial"/>
+          <w:i/>
+        </w:rPr>
+      </w:pPr>
+    </w:p>
+    <w:p>
+      <w:pPr>
+        <w:rPr>
+          <w:rFonts w:ascii="Arial" w:hAnsi="Arial" w:cs="Arial"/>
+          <w:i/>
+        </w:rPr>
+      </w:pPr>
+    </w:p>
+    <w:p>
+      <w:pPr>
+        <w:rPr>
+          <w:rFonts w:ascii="Arial" w:hAnsi="Arial" w:cs="Arial"/>
+          <w:i/>
+        </w:rPr>
+      </w:pPr>
+    </w:p>
+    <w:p>
+      <w:pPr>
+        <w:rPr>
+          <w:rFonts w:ascii="Arial" w:hAnsi="Arial" w:cs="Arial"/>
+          <w:i/>
+        </w:rPr>
+      </w:pPr>
+    </w:p>
+    <w:p>
+      <w:pPr>
+        <w:rPr>
+          <w:rFonts w:ascii="Arial" w:hAnsi="Arial" w:cs="Arial"/>
+          <w:i/>
+        </w:rPr>
+      </w:pPr>
+    </w:p>
+    <w:p>
+      <w:pPr>
+        <w:rPr>
+          <w:rFonts w:ascii="Arial" w:hAnsi="Arial" w:cs="Arial"/>
+          <w:i/>
+        </w:rPr>
+      </w:pPr>
+    </w:p>
+    <w:p>
+      <w:pPr>
+        <w:rPr>
+          <w:rFonts w:ascii="Arial" w:hAnsi="Arial" w:cs="Arial"/>
+          <w:i/>
+        </w:rPr>
+      </w:pPr>
     </w:p>
     <w:p>
       <w:pPr>
@@ -13048,6 +12881,7 @@
         <w:rPr>
           <w:rFonts w:ascii="Arial" w:hAnsi="Arial" w:cs="Arial"/>
         </w:rPr>
+        <w:lastRenderedPageBreak/>
         <w:t xml:space="preserve"> </w:t>
       </w:r>
       <w:bookmarkStart w:id="51" w:name="_Toc230160348"/>
@@ -13436,14 +13270,14 @@
       </w:r>
     </w:p>
     <w:sectPr>
-      <w:headerReference w:type="even" r:id="rId11"/>
-      <w:headerReference w:type="default" r:id="rId12"/>
-      <w:footerReference w:type="even" r:id="rId13"/>
-      <w:footerReference w:type="default" r:id="rId14"/>
-      <w:headerReference w:type="first" r:id="rId15"/>
-      <w:footerReference w:type="first" r:id="rId16"/>
+      <w:headerReference w:type="even" r:id="rId14"/>
+      <w:headerReference w:type="default" r:id="rId15"/>
+      <w:footerReference w:type="even" r:id="rId16"/>
+      <w:footerReference w:type="default" r:id="rId17"/>
+      <w:headerReference w:type="first" r:id="rId18"/>
+      <w:footerReference w:type="first" r:id="rId19"/>
       <w:pgSz w:w="11906" w:h="16838"/>
-      <w:pgMar w:top="1417" w:right="1417" w:bottom="1134" w:left="1417" w:header="708" w:footer="708" w:gutter="0"/>
+      <w:pgMar w:top="1135" w:right="1417" w:bottom="1134" w:left="1417" w:header="708" w:footer="708" w:gutter="0"/>
       <w:cols w:space="708"/>
       <w:docGrid w:linePitch="360"/>
     </w:sectPr>

</xml_diff>

<commit_message>
[LOGIC] Added remaining known endpoints for WorkspaceController
</commit_message>
<xml_diff>
--- a/0_Documents/Pflichtenheft.docx
+++ b/0_Documents/Pflichtenheft.docx
@@ -1390,7 +1390,7 @@
             </w:rPr>
             <w:fldChar w:fldCharType="separate"/>
           </w:r>
-          <w:hyperlink w:anchor="_Toc230160297" w:history="1">
+          <w:hyperlink w:anchor="_Toc230179969" w:history="1">
             <w:r>
               <w:rPr>
                 <w:rStyle w:val="Hyperlink"/>
@@ -1438,7 +1438,7 @@
                 <w:noProof/>
                 <w:webHidden/>
               </w:rPr>
-              <w:instrText xml:space="preserve"> PAGEREF _Toc230160297 \h </w:instrText>
+              <w:instrText xml:space="preserve"> PAGEREF _Toc230179969 \h </w:instrText>
             </w:r>
             <w:r>
               <w:rPr>
@@ -1486,7 +1486,7 @@
               <w14:ligatures w14:val="standardContextual"/>
             </w:rPr>
           </w:pPr>
-          <w:hyperlink w:anchor="_Toc230160298" w:history="1">
+          <w:hyperlink w:anchor="_Toc230179970" w:history="1">
             <w:r>
               <w:rPr>
                 <w:rStyle w:val="Hyperlink"/>
@@ -1534,7 +1534,7 @@
                 <w:noProof/>
                 <w:webHidden/>
               </w:rPr>
-              <w:instrText xml:space="preserve"> PAGEREF _Toc230160298 \h </w:instrText>
+              <w:instrText xml:space="preserve"> PAGEREF _Toc230179970 \h </w:instrText>
             </w:r>
             <w:r>
               <w:rPr>
@@ -1582,7 +1582,7 @@
               <w14:ligatures w14:val="standardContextual"/>
             </w:rPr>
           </w:pPr>
-          <w:hyperlink w:anchor="_Toc230160299" w:history="1">
+          <w:hyperlink w:anchor="_Toc230179971" w:history="1">
             <w:r>
               <w:rPr>
                 <w:rStyle w:val="Hyperlink"/>
@@ -1630,7 +1630,7 @@
                 <w:noProof/>
                 <w:webHidden/>
               </w:rPr>
-              <w:instrText xml:space="preserve"> PAGEREF _Toc230160299 \h </w:instrText>
+              <w:instrText xml:space="preserve"> PAGEREF _Toc230179971 \h </w:instrText>
             </w:r>
             <w:r>
               <w:rPr>
@@ -1678,7 +1678,7 @@
               <w14:ligatures w14:val="standardContextual"/>
             </w:rPr>
           </w:pPr>
-          <w:hyperlink w:anchor="_Toc230160300" w:history="1">
+          <w:hyperlink w:anchor="_Toc230179972" w:history="1">
             <w:r>
               <w:rPr>
                 <w:rStyle w:val="Hyperlink"/>
@@ -1726,7 +1726,7 @@
                 <w:noProof/>
                 <w:webHidden/>
               </w:rPr>
-              <w:instrText xml:space="preserve"> PAGEREF _Toc230160300 \h </w:instrText>
+              <w:instrText xml:space="preserve"> PAGEREF _Toc230179972 \h </w:instrText>
             </w:r>
             <w:r>
               <w:rPr>
@@ -1746,7 +1746,7 @@
                 <w:noProof/>
                 <w:webHidden/>
               </w:rPr>
-              <w:t>3</w:t>
+              <w:t>4</w:t>
             </w:r>
             <w:r>
               <w:rPr>
@@ -1774,7 +1774,7 @@
               <w14:ligatures w14:val="standardContextual"/>
             </w:rPr>
           </w:pPr>
-          <w:hyperlink w:anchor="_Toc230160301" w:history="1">
+          <w:hyperlink w:anchor="_Toc230179973" w:history="1">
             <w:r>
               <w:rPr>
                 <w:rStyle w:val="Hyperlink"/>
@@ -1822,7 +1822,7 @@
                 <w:noProof/>
                 <w:webHidden/>
               </w:rPr>
-              <w:instrText xml:space="preserve"> PAGEREF _Toc230160301 \h </w:instrText>
+              <w:instrText xml:space="preserve"> PAGEREF _Toc230179973 \h </w:instrText>
             </w:r>
             <w:r>
               <w:rPr>
@@ -1870,7 +1870,7 @@
               <w14:ligatures w14:val="standardContextual"/>
             </w:rPr>
           </w:pPr>
-          <w:hyperlink w:anchor="_Toc230160302" w:history="1">
+          <w:hyperlink w:anchor="_Toc230179974" w:history="1">
             <w:r>
               <w:rPr>
                 <w:rStyle w:val="Hyperlink"/>
@@ -1918,7 +1918,7 @@
                 <w:noProof/>
                 <w:webHidden/>
               </w:rPr>
-              <w:instrText xml:space="preserve"> PAGEREF _Toc230160302 \h </w:instrText>
+              <w:instrText xml:space="preserve"> PAGEREF _Toc230179974 \h </w:instrText>
             </w:r>
             <w:r>
               <w:rPr>
@@ -1966,7 +1966,7 @@
               <w14:ligatures w14:val="standardContextual"/>
             </w:rPr>
           </w:pPr>
-          <w:hyperlink w:anchor="_Toc230160303" w:history="1">
+          <w:hyperlink w:anchor="_Toc230179975" w:history="1">
             <w:r>
               <w:rPr>
                 <w:rStyle w:val="Hyperlink"/>
@@ -2014,7 +2014,7 @@
                 <w:noProof/>
                 <w:webHidden/>
               </w:rPr>
-              <w:instrText xml:space="preserve"> PAGEREF _Toc230160303 \h </w:instrText>
+              <w:instrText xml:space="preserve"> PAGEREF _Toc230179975 \h </w:instrText>
             </w:r>
             <w:r>
               <w:rPr>
@@ -2062,7 +2062,7 @@
               <w14:ligatures w14:val="standardContextual"/>
             </w:rPr>
           </w:pPr>
-          <w:hyperlink w:anchor="_Toc230160304" w:history="1">
+          <w:hyperlink w:anchor="_Toc230179976" w:history="1">
             <w:r>
               <w:rPr>
                 <w:rStyle w:val="Hyperlink"/>
@@ -2110,7 +2110,7 @@
                 <w:noProof/>
                 <w:webHidden/>
               </w:rPr>
-              <w:instrText xml:space="preserve"> PAGEREF _Toc230160304 \h </w:instrText>
+              <w:instrText xml:space="preserve"> PAGEREF _Toc230179976 \h </w:instrText>
             </w:r>
             <w:r>
               <w:rPr>
@@ -2158,7 +2158,7 @@
               <w14:ligatures w14:val="standardContextual"/>
             </w:rPr>
           </w:pPr>
-          <w:hyperlink w:anchor="_Toc230160305" w:history="1">
+          <w:hyperlink w:anchor="_Toc230179977" w:history="1">
             <w:r>
               <w:rPr>
                 <w:rStyle w:val="Hyperlink"/>
@@ -2206,7 +2206,7 @@
                 <w:noProof/>
                 <w:webHidden/>
               </w:rPr>
-              <w:instrText xml:space="preserve"> PAGEREF _Toc230160305 \h </w:instrText>
+              <w:instrText xml:space="preserve"> PAGEREF _Toc230179977 \h </w:instrText>
             </w:r>
             <w:r>
               <w:rPr>
@@ -2226,7 +2226,7 @@
                 <w:noProof/>
                 <w:webHidden/>
               </w:rPr>
-              <w:t>4</w:t>
+              <w:t>5</w:t>
             </w:r>
             <w:r>
               <w:rPr>
@@ -2254,7 +2254,7 @@
               <w14:ligatures w14:val="standardContextual"/>
             </w:rPr>
           </w:pPr>
-          <w:hyperlink w:anchor="_Toc230160306" w:history="1">
+          <w:hyperlink w:anchor="_Toc230179978" w:history="1">
             <w:r>
               <w:rPr>
                 <w:rStyle w:val="Hyperlink"/>
@@ -2302,7 +2302,7 @@
                 <w:noProof/>
                 <w:webHidden/>
               </w:rPr>
-              <w:instrText xml:space="preserve"> PAGEREF _Toc230160306 \h </w:instrText>
+              <w:instrText xml:space="preserve"> PAGEREF _Toc230179978 \h </w:instrText>
             </w:r>
             <w:r>
               <w:rPr>
@@ -2350,7 +2350,7 @@
               <w14:ligatures w14:val="standardContextual"/>
             </w:rPr>
           </w:pPr>
-          <w:hyperlink w:anchor="_Toc230160307" w:history="1">
+          <w:hyperlink w:anchor="_Toc230179979" w:history="1">
             <w:r>
               <w:rPr>
                 <w:rStyle w:val="Hyperlink"/>
@@ -2398,7 +2398,7 @@
                 <w:noProof/>
                 <w:webHidden/>
               </w:rPr>
-              <w:instrText xml:space="preserve"> PAGEREF _Toc230160307 \h </w:instrText>
+              <w:instrText xml:space="preserve"> PAGEREF _Toc230179979 \h </w:instrText>
             </w:r>
             <w:r>
               <w:rPr>
@@ -2446,7 +2446,7 @@
               <w14:ligatures w14:val="standardContextual"/>
             </w:rPr>
           </w:pPr>
-          <w:hyperlink w:anchor="_Toc230160308" w:history="1">
+          <w:hyperlink w:anchor="_Toc230179980" w:history="1">
             <w:r>
               <w:rPr>
                 <w:rStyle w:val="Hyperlink"/>
@@ -2494,7 +2494,7 @@
                 <w:noProof/>
                 <w:webHidden/>
               </w:rPr>
-              <w:instrText xml:space="preserve"> PAGEREF _Toc230160308 \h </w:instrText>
+              <w:instrText xml:space="preserve"> PAGEREF _Toc230179980 \h </w:instrText>
             </w:r>
             <w:r>
               <w:rPr>
@@ -2542,7 +2542,7 @@
               <w14:ligatures w14:val="standardContextual"/>
             </w:rPr>
           </w:pPr>
-          <w:hyperlink w:anchor="_Toc230160309" w:history="1">
+          <w:hyperlink w:anchor="_Toc230179981" w:history="1">
             <w:r>
               <w:rPr>
                 <w:rStyle w:val="Hyperlink"/>
@@ -2590,7 +2590,7 @@
                 <w:noProof/>
                 <w:webHidden/>
               </w:rPr>
-              <w:instrText xml:space="preserve"> PAGEREF _Toc230160309 \h </w:instrText>
+              <w:instrText xml:space="preserve"> PAGEREF _Toc230179981 \h </w:instrText>
             </w:r>
             <w:r>
               <w:rPr>
@@ -2638,7 +2638,7 @@
               <w14:ligatures w14:val="standardContextual"/>
             </w:rPr>
           </w:pPr>
-          <w:hyperlink w:anchor="_Toc230160310" w:history="1">
+          <w:hyperlink w:anchor="_Toc230179982" w:history="1">
             <w:r>
               <w:rPr>
                 <w:rStyle w:val="Hyperlink"/>
@@ -2686,7 +2686,7 @@
                 <w:noProof/>
                 <w:webHidden/>
               </w:rPr>
-              <w:instrText xml:space="preserve"> PAGEREF _Toc230160310 \h </w:instrText>
+              <w:instrText xml:space="preserve"> PAGEREF _Toc230179982 \h </w:instrText>
             </w:r>
             <w:r>
               <w:rPr>
@@ -2734,7 +2734,7 @@
               <w14:ligatures w14:val="standardContextual"/>
             </w:rPr>
           </w:pPr>
-          <w:hyperlink w:anchor="_Toc230160311" w:history="1">
+          <w:hyperlink w:anchor="_Toc230179983" w:history="1">
             <w:r>
               <w:rPr>
                 <w:rStyle w:val="Hyperlink"/>
@@ -2782,7 +2782,7 @@
                 <w:noProof/>
                 <w:webHidden/>
               </w:rPr>
-              <w:instrText xml:space="preserve"> PAGEREF _Toc230160311 \h </w:instrText>
+              <w:instrText xml:space="preserve"> PAGEREF _Toc230179983 \h </w:instrText>
             </w:r>
             <w:r>
               <w:rPr>
@@ -2830,7 +2830,7 @@
               <w14:ligatures w14:val="standardContextual"/>
             </w:rPr>
           </w:pPr>
-          <w:hyperlink w:anchor="_Toc230160312" w:history="1">
+          <w:hyperlink w:anchor="_Toc230179984" w:history="1">
             <w:r>
               <w:rPr>
                 <w:rStyle w:val="Hyperlink"/>
@@ -2878,7 +2878,7 @@
                 <w:noProof/>
                 <w:webHidden/>
               </w:rPr>
-              <w:instrText xml:space="preserve"> PAGEREF _Toc230160312 \h </w:instrText>
+              <w:instrText xml:space="preserve"> PAGEREF _Toc230179984 \h </w:instrText>
             </w:r>
             <w:r>
               <w:rPr>
@@ -2926,7 +2926,7 @@
               <w14:ligatures w14:val="standardContextual"/>
             </w:rPr>
           </w:pPr>
-          <w:hyperlink w:anchor="_Toc230160313" w:history="1">
+          <w:hyperlink w:anchor="_Toc230179985" w:history="1">
             <w:r>
               <w:rPr>
                 <w:rStyle w:val="Hyperlink"/>
@@ -2974,7 +2974,7 @@
                 <w:noProof/>
                 <w:webHidden/>
               </w:rPr>
-              <w:instrText xml:space="preserve"> PAGEREF _Toc230160313 \h </w:instrText>
+              <w:instrText xml:space="preserve"> PAGEREF _Toc230179985 \h </w:instrText>
             </w:r>
             <w:r>
               <w:rPr>
@@ -2994,7 +2994,7 @@
                 <w:noProof/>
                 <w:webHidden/>
               </w:rPr>
-              <w:t>7</w:t>
+              <w:t>6</w:t>
             </w:r>
             <w:r>
               <w:rPr>
@@ -3022,7 +3022,7 @@
               <w14:ligatures w14:val="standardContextual"/>
             </w:rPr>
           </w:pPr>
-          <w:hyperlink w:anchor="_Toc230160314" w:history="1">
+          <w:hyperlink w:anchor="_Toc230179986" w:history="1">
             <w:r>
               <w:rPr>
                 <w:rStyle w:val="Hyperlink"/>
@@ -3070,7 +3070,7 @@
                 <w:noProof/>
                 <w:webHidden/>
               </w:rPr>
-              <w:instrText xml:space="preserve"> PAGEREF _Toc230160314 \h </w:instrText>
+              <w:instrText xml:space="preserve"> PAGEREF _Toc230179986 \h </w:instrText>
             </w:r>
             <w:r>
               <w:rPr>
@@ -3118,7 +3118,7 @@
               <w14:ligatures w14:val="standardContextual"/>
             </w:rPr>
           </w:pPr>
-          <w:hyperlink w:anchor="_Toc230160315" w:history="1">
+          <w:hyperlink w:anchor="_Toc230179987" w:history="1">
             <w:r>
               <w:rPr>
                 <w:rStyle w:val="Hyperlink"/>
@@ -3166,7 +3166,7 @@
                 <w:noProof/>
                 <w:webHidden/>
               </w:rPr>
-              <w:instrText xml:space="preserve"> PAGEREF _Toc230160315 \h </w:instrText>
+              <w:instrText xml:space="preserve"> PAGEREF _Toc230179987 \h </w:instrText>
             </w:r>
             <w:r>
               <w:rPr>
@@ -3214,7 +3214,7 @@
               <w14:ligatures w14:val="standardContextual"/>
             </w:rPr>
           </w:pPr>
-          <w:hyperlink w:anchor="_Toc230160316" w:history="1">
+          <w:hyperlink w:anchor="_Toc230179988" w:history="1">
             <w:r>
               <w:rPr>
                 <w:rStyle w:val="Hyperlink"/>
@@ -3262,7 +3262,7 @@
                 <w:noProof/>
                 <w:webHidden/>
               </w:rPr>
-              <w:instrText xml:space="preserve"> PAGEREF _Toc230160316 \h </w:instrText>
+              <w:instrText xml:space="preserve"> PAGEREF _Toc230179988 \h </w:instrText>
             </w:r>
             <w:r>
               <w:rPr>
@@ -3309,7 +3309,7 @@
               <w14:ligatures w14:val="standardContextual"/>
             </w:rPr>
           </w:pPr>
-          <w:hyperlink w:anchor="_Toc230160317" w:history="1">
+          <w:hyperlink w:anchor="_Toc230179989" w:history="1">
             <w:r>
               <w:rPr>
                 <w:rStyle w:val="Hyperlink"/>
@@ -3336,7 +3336,7 @@
                 <w:noProof/>
                 <w:webHidden/>
               </w:rPr>
-              <w:instrText xml:space="preserve"> PAGEREF _Toc230160317 \h </w:instrText>
+              <w:instrText xml:space="preserve"> PAGEREF _Toc230179989 \h </w:instrText>
             </w:r>
             <w:r>
               <w:rPr>
@@ -3383,7 +3383,7 @@
               <w14:ligatures w14:val="standardContextual"/>
             </w:rPr>
           </w:pPr>
-          <w:hyperlink w:anchor="_Toc230160318" w:history="1">
+          <w:hyperlink w:anchor="_Toc230179990" w:history="1">
             <w:r>
               <w:rPr>
                 <w:rStyle w:val="Hyperlink"/>
@@ -3410,7 +3410,7 @@
                 <w:noProof/>
                 <w:webHidden/>
               </w:rPr>
-              <w:instrText xml:space="preserve"> PAGEREF _Toc230160318 \h </w:instrText>
+              <w:instrText xml:space="preserve"> PAGEREF _Toc230179990 \h </w:instrText>
             </w:r>
             <w:r>
               <w:rPr>
@@ -3458,7 +3458,7 @@
               <w14:ligatures w14:val="standardContextual"/>
             </w:rPr>
           </w:pPr>
-          <w:hyperlink w:anchor="_Toc230160319" w:history="1">
+          <w:hyperlink w:anchor="_Toc230179991" w:history="1">
             <w:r>
               <w:rPr>
                 <w:rStyle w:val="Hyperlink"/>
@@ -3506,7 +3506,7 @@
                 <w:noProof/>
                 <w:webHidden/>
               </w:rPr>
-              <w:instrText xml:space="preserve"> PAGEREF _Toc230160319 \h </w:instrText>
+              <w:instrText xml:space="preserve"> PAGEREF _Toc230179991 \h </w:instrText>
             </w:r>
             <w:r>
               <w:rPr>
@@ -3553,7 +3553,7 @@
               <w14:ligatures w14:val="standardContextual"/>
             </w:rPr>
           </w:pPr>
-          <w:hyperlink w:anchor="_Toc230160320" w:history="1">
+          <w:hyperlink w:anchor="_Toc230179992" w:history="1">
             <w:r>
               <w:rPr>
                 <w:rStyle w:val="Hyperlink"/>
@@ -3580,7 +3580,7 @@
                 <w:noProof/>
                 <w:webHidden/>
               </w:rPr>
-              <w:instrText xml:space="preserve"> PAGEREF _Toc230160320 \h </w:instrText>
+              <w:instrText xml:space="preserve"> PAGEREF _Toc230179992 \h </w:instrText>
             </w:r>
             <w:r>
               <w:rPr>
@@ -3627,7 +3627,7 @@
               <w14:ligatures w14:val="standardContextual"/>
             </w:rPr>
           </w:pPr>
-          <w:hyperlink w:anchor="_Toc230160321" w:history="1">
+          <w:hyperlink w:anchor="_Toc230179993" w:history="1">
             <w:r>
               <w:rPr>
                 <w:rStyle w:val="Hyperlink"/>
@@ -3654,7 +3654,7 @@
                 <w:noProof/>
                 <w:webHidden/>
               </w:rPr>
-              <w:instrText xml:space="preserve"> PAGEREF _Toc230160321 \h </w:instrText>
+              <w:instrText xml:space="preserve"> PAGEREF _Toc230179993 \h </w:instrText>
             </w:r>
             <w:r>
               <w:rPr>
@@ -3702,7 +3702,7 @@
               <w14:ligatures w14:val="standardContextual"/>
             </w:rPr>
           </w:pPr>
-          <w:hyperlink w:anchor="_Toc230160322" w:history="1">
+          <w:hyperlink w:anchor="_Toc230179994" w:history="1">
             <w:r>
               <w:rPr>
                 <w:rStyle w:val="Hyperlink"/>
@@ -3750,7 +3750,7 @@
                 <w:noProof/>
                 <w:webHidden/>
               </w:rPr>
-              <w:instrText xml:space="preserve"> PAGEREF _Toc230160322 \h </w:instrText>
+              <w:instrText xml:space="preserve"> PAGEREF _Toc230179994 \h </w:instrText>
             </w:r>
             <w:r>
               <w:rPr>
@@ -3797,7 +3797,7 @@
               <w14:ligatures w14:val="standardContextual"/>
             </w:rPr>
           </w:pPr>
-          <w:hyperlink w:anchor="_Toc230160323" w:history="1">
+          <w:hyperlink w:anchor="_Toc230179995" w:history="1">
             <w:r>
               <w:rPr>
                 <w:rStyle w:val="Hyperlink"/>
@@ -3824,7 +3824,7 @@
                 <w:noProof/>
                 <w:webHidden/>
               </w:rPr>
-              <w:instrText xml:space="preserve"> PAGEREF _Toc230160323 \h </w:instrText>
+              <w:instrText xml:space="preserve"> PAGEREF _Toc230179995 \h </w:instrText>
             </w:r>
             <w:r>
               <w:rPr>
@@ -3871,7 +3871,7 @@
               <w14:ligatures w14:val="standardContextual"/>
             </w:rPr>
           </w:pPr>
-          <w:hyperlink w:anchor="_Toc230160324" w:history="1">
+          <w:hyperlink w:anchor="_Toc230179996" w:history="1">
             <w:r>
               <w:rPr>
                 <w:rStyle w:val="Hyperlink"/>
@@ -3898,7 +3898,7 @@
                 <w:noProof/>
                 <w:webHidden/>
               </w:rPr>
-              <w:instrText xml:space="preserve"> PAGEREF _Toc230160324 \h </w:instrText>
+              <w:instrText xml:space="preserve"> PAGEREF _Toc230179996 \h </w:instrText>
             </w:r>
             <w:r>
               <w:rPr>
@@ -3946,7 +3946,7 @@
               <w14:ligatures w14:val="standardContextual"/>
             </w:rPr>
           </w:pPr>
-          <w:hyperlink w:anchor="_Toc230160325" w:history="1">
+          <w:hyperlink w:anchor="_Toc230179997" w:history="1">
             <w:r>
               <w:rPr>
                 <w:rStyle w:val="Hyperlink"/>
@@ -3994,7 +3994,7 @@
                 <w:noProof/>
                 <w:webHidden/>
               </w:rPr>
-              <w:instrText xml:space="preserve"> PAGEREF _Toc230160325 \h </w:instrText>
+              <w:instrText xml:space="preserve"> PAGEREF _Toc230179997 \h </w:instrText>
             </w:r>
             <w:r>
               <w:rPr>
@@ -4041,7 +4041,7 @@
               <w14:ligatures w14:val="standardContextual"/>
             </w:rPr>
           </w:pPr>
-          <w:hyperlink w:anchor="_Toc230160326" w:history="1">
+          <w:hyperlink w:anchor="_Toc230179998" w:history="1">
             <w:r>
               <w:rPr>
                 <w:rStyle w:val="Hyperlink"/>
@@ -4068,7 +4068,7 @@
                 <w:noProof/>
                 <w:webHidden/>
               </w:rPr>
-              <w:instrText xml:space="preserve"> PAGEREF _Toc230160326 \h </w:instrText>
+              <w:instrText xml:space="preserve"> PAGEREF _Toc230179998 \h </w:instrText>
             </w:r>
             <w:r>
               <w:rPr>
@@ -4115,7 +4115,7 @@
               <w14:ligatures w14:val="standardContextual"/>
             </w:rPr>
           </w:pPr>
-          <w:hyperlink w:anchor="_Toc230160327" w:history="1">
+          <w:hyperlink w:anchor="_Toc230179999" w:history="1">
             <w:r>
               <w:rPr>
                 <w:rStyle w:val="Hyperlink"/>
@@ -4142,7 +4142,7 @@
                 <w:noProof/>
                 <w:webHidden/>
               </w:rPr>
-              <w:instrText xml:space="preserve"> PAGEREF _Toc230160327 \h </w:instrText>
+              <w:instrText xml:space="preserve"> PAGEREF _Toc230179999 \h </w:instrText>
             </w:r>
             <w:r>
               <w:rPr>
@@ -4190,7 +4190,7 @@
               <w14:ligatures w14:val="standardContextual"/>
             </w:rPr>
           </w:pPr>
-          <w:hyperlink w:anchor="_Toc230160328" w:history="1">
+          <w:hyperlink w:anchor="_Toc230180000" w:history="1">
             <w:r>
               <w:rPr>
                 <w:rStyle w:val="Hyperlink"/>
@@ -4238,7 +4238,7 @@
                 <w:noProof/>
                 <w:webHidden/>
               </w:rPr>
-              <w:instrText xml:space="preserve"> PAGEREF _Toc230160328 \h </w:instrText>
+              <w:instrText xml:space="preserve"> PAGEREF _Toc230180000 \h </w:instrText>
             </w:r>
             <w:r>
               <w:rPr>
@@ -4258,7 +4258,7 @@
                 <w:noProof/>
                 <w:webHidden/>
               </w:rPr>
-              <w:t>8</w:t>
+              <w:t>9</w:t>
             </w:r>
             <w:r>
               <w:rPr>
@@ -4285,7 +4285,7 @@
               <w14:ligatures w14:val="standardContextual"/>
             </w:rPr>
           </w:pPr>
-          <w:hyperlink w:anchor="_Toc230160329" w:history="1">
+          <w:hyperlink w:anchor="_Toc230180001" w:history="1">
             <w:r>
               <w:rPr>
                 <w:rStyle w:val="Hyperlink"/>
@@ -4312,7 +4312,7 @@
                 <w:noProof/>
                 <w:webHidden/>
               </w:rPr>
-              <w:instrText xml:space="preserve"> PAGEREF _Toc230160329 \h </w:instrText>
+              <w:instrText xml:space="preserve"> PAGEREF _Toc230180001 \h </w:instrText>
             </w:r>
             <w:r>
               <w:rPr>
@@ -4332,7 +4332,7 @@
                 <w:noProof/>
                 <w:webHidden/>
               </w:rPr>
-              <w:t>8</w:t>
+              <w:t>9</w:t>
             </w:r>
             <w:r>
               <w:rPr>
@@ -4359,7 +4359,7 @@
               <w14:ligatures w14:val="standardContextual"/>
             </w:rPr>
           </w:pPr>
-          <w:hyperlink w:anchor="_Toc230160330" w:history="1">
+          <w:hyperlink w:anchor="_Toc230180002" w:history="1">
             <w:r>
               <w:rPr>
                 <w:rStyle w:val="Hyperlink"/>
@@ -4386,7 +4386,7 @@
                 <w:noProof/>
                 <w:webHidden/>
               </w:rPr>
-              <w:instrText xml:space="preserve"> PAGEREF _Toc230160330 \h </w:instrText>
+              <w:instrText xml:space="preserve"> PAGEREF _Toc230180002 \h </w:instrText>
             </w:r>
             <w:r>
               <w:rPr>
@@ -4434,7 +4434,7 @@
               <w14:ligatures w14:val="standardContextual"/>
             </w:rPr>
           </w:pPr>
-          <w:hyperlink w:anchor="_Toc230160331" w:history="1">
+          <w:hyperlink w:anchor="_Toc230180003" w:history="1">
             <w:r>
               <w:rPr>
                 <w:rStyle w:val="Hyperlink"/>
@@ -4482,7 +4482,7 @@
                 <w:noProof/>
                 <w:webHidden/>
               </w:rPr>
-              <w:instrText xml:space="preserve"> PAGEREF _Toc230160331 \h </w:instrText>
+              <w:instrText xml:space="preserve"> PAGEREF _Toc230180003 \h </w:instrText>
             </w:r>
             <w:r>
               <w:rPr>
@@ -4502,7 +4502,7 @@
                 <w:noProof/>
                 <w:webHidden/>
               </w:rPr>
-              <w:t>9</w:t>
+              <w:t>10</w:t>
             </w:r>
             <w:r>
               <w:rPr>
@@ -4529,7 +4529,7 @@
               <w14:ligatures w14:val="standardContextual"/>
             </w:rPr>
           </w:pPr>
-          <w:hyperlink w:anchor="_Toc230160332" w:history="1">
+          <w:hyperlink w:anchor="_Toc230180004" w:history="1">
             <w:r>
               <w:rPr>
                 <w:rStyle w:val="Hyperlink"/>
@@ -4556,7 +4556,7 @@
                 <w:noProof/>
                 <w:webHidden/>
               </w:rPr>
-              <w:instrText xml:space="preserve"> PAGEREF _Toc230160332 \h </w:instrText>
+              <w:instrText xml:space="preserve"> PAGEREF _Toc230180004 \h </w:instrText>
             </w:r>
             <w:r>
               <w:rPr>
@@ -4576,7 +4576,7 @@
                 <w:noProof/>
                 <w:webHidden/>
               </w:rPr>
-              <w:t>9</w:t>
+              <w:t>10</w:t>
             </w:r>
             <w:r>
               <w:rPr>
@@ -4603,7 +4603,7 @@
               <w14:ligatures w14:val="standardContextual"/>
             </w:rPr>
           </w:pPr>
-          <w:hyperlink w:anchor="_Toc230160333" w:history="1">
+          <w:hyperlink w:anchor="_Toc230180005" w:history="1">
             <w:r>
               <w:rPr>
                 <w:rStyle w:val="Hyperlink"/>
@@ -4630,7 +4630,7 @@
                 <w:noProof/>
                 <w:webHidden/>
               </w:rPr>
-              <w:instrText xml:space="preserve"> PAGEREF _Toc230160333 \h </w:instrText>
+              <w:instrText xml:space="preserve"> PAGEREF _Toc230180005 \h </w:instrText>
             </w:r>
             <w:r>
               <w:rPr>
@@ -4650,7 +4650,7 @@
                 <w:noProof/>
                 <w:webHidden/>
               </w:rPr>
-              <w:t>9</w:t>
+              <w:t>10</w:t>
             </w:r>
             <w:r>
               <w:rPr>
@@ -4678,7 +4678,7 @@
               <w14:ligatures w14:val="standardContextual"/>
             </w:rPr>
           </w:pPr>
-          <w:hyperlink w:anchor="_Toc230160334" w:history="1">
+          <w:hyperlink w:anchor="_Toc230180006" w:history="1">
             <w:r>
               <w:rPr>
                 <w:rStyle w:val="Hyperlink"/>
@@ -4726,7 +4726,7 @@
                 <w:noProof/>
                 <w:webHidden/>
               </w:rPr>
-              <w:instrText xml:space="preserve"> PAGEREF _Toc230160334 \h </w:instrText>
+              <w:instrText xml:space="preserve"> PAGEREF _Toc230180006 \h </w:instrText>
             </w:r>
             <w:r>
               <w:rPr>
@@ -4746,7 +4746,7 @@
                 <w:noProof/>
                 <w:webHidden/>
               </w:rPr>
-              <w:t>9</w:t>
+              <w:t>11</w:t>
             </w:r>
             <w:r>
               <w:rPr>
@@ -4774,7 +4774,7 @@
               <w14:ligatures w14:val="standardContextual"/>
             </w:rPr>
           </w:pPr>
-          <w:hyperlink w:anchor="_Toc230160335" w:history="1">
+          <w:hyperlink w:anchor="_Toc230180007" w:history="1">
             <w:r>
               <w:rPr>
                 <w:rStyle w:val="Hyperlink"/>
@@ -4822,7 +4822,7 @@
                 <w:noProof/>
                 <w:webHidden/>
               </w:rPr>
-              <w:instrText xml:space="preserve"> PAGEREF _Toc230160335 \h </w:instrText>
+              <w:instrText xml:space="preserve"> PAGEREF _Toc230180007 \h </w:instrText>
             </w:r>
             <w:r>
               <w:rPr>
@@ -4842,7 +4842,7 @@
                 <w:noProof/>
                 <w:webHidden/>
               </w:rPr>
-              <w:t>10</w:t>
+              <w:t>11</w:t>
             </w:r>
             <w:r>
               <w:rPr>
@@ -4870,7 +4870,7 @@
               <w14:ligatures w14:val="standardContextual"/>
             </w:rPr>
           </w:pPr>
-          <w:hyperlink w:anchor="_Toc230160336" w:history="1">
+          <w:hyperlink w:anchor="_Toc230180008" w:history="1">
             <w:r>
               <w:rPr>
                 <w:rStyle w:val="Hyperlink"/>
@@ -4918,7 +4918,7 @@
                 <w:noProof/>
                 <w:webHidden/>
               </w:rPr>
-              <w:instrText xml:space="preserve"> PAGEREF _Toc230160336 \h </w:instrText>
+              <w:instrText xml:space="preserve"> PAGEREF _Toc230180008 \h </w:instrText>
             </w:r>
             <w:r>
               <w:rPr>
@@ -4938,7 +4938,7 @@
                 <w:noProof/>
                 <w:webHidden/>
               </w:rPr>
-              <w:t>10</w:t>
+              <w:t>11</w:t>
             </w:r>
             <w:r>
               <w:rPr>
@@ -4966,7 +4966,7 @@
               <w14:ligatures w14:val="standardContextual"/>
             </w:rPr>
           </w:pPr>
-          <w:hyperlink w:anchor="_Toc230160337" w:history="1">
+          <w:hyperlink w:anchor="_Toc230180009" w:history="1">
             <w:r>
               <w:rPr>
                 <w:rStyle w:val="Hyperlink"/>
@@ -5014,7 +5014,7 @@
                 <w:noProof/>
                 <w:webHidden/>
               </w:rPr>
-              <w:instrText xml:space="preserve"> PAGEREF _Toc230160337 \h </w:instrText>
+              <w:instrText xml:space="preserve"> PAGEREF _Toc230180009 \h </w:instrText>
             </w:r>
             <w:r>
               <w:rPr>
@@ -5034,7 +5034,7 @@
                 <w:noProof/>
                 <w:webHidden/>
               </w:rPr>
-              <w:t>10</w:t>
+              <w:t>11</w:t>
             </w:r>
             <w:r>
               <w:rPr>
@@ -5061,7 +5061,7 @@
               <w14:ligatures w14:val="standardContextual"/>
             </w:rPr>
           </w:pPr>
-          <w:hyperlink w:anchor="_Toc230160338" w:history="1">
+          <w:hyperlink w:anchor="_Toc230180010" w:history="1">
             <w:r>
               <w:rPr>
                 <w:rStyle w:val="Hyperlink"/>
@@ -5088,7 +5088,7 @@
                 <w:noProof/>
                 <w:webHidden/>
               </w:rPr>
-              <w:instrText xml:space="preserve"> PAGEREF _Toc230160338 \h </w:instrText>
+              <w:instrText xml:space="preserve"> PAGEREF _Toc230180010 \h </w:instrText>
             </w:r>
             <w:r>
               <w:rPr>
@@ -5108,7 +5108,7 @@
                 <w:noProof/>
                 <w:webHidden/>
               </w:rPr>
-              <w:t>10</w:t>
+              <w:t>11</w:t>
             </w:r>
             <w:r>
               <w:rPr>
@@ -5135,7 +5135,7 @@
               <w14:ligatures w14:val="standardContextual"/>
             </w:rPr>
           </w:pPr>
-          <w:hyperlink w:anchor="_Toc230160339" w:history="1">
+          <w:hyperlink w:anchor="_Toc230180011" w:history="1">
             <w:r>
               <w:rPr>
                 <w:rStyle w:val="Hyperlink"/>
@@ -5162,7 +5162,7 @@
                 <w:noProof/>
                 <w:webHidden/>
               </w:rPr>
-              <w:instrText xml:space="preserve"> PAGEREF _Toc230160339 \h </w:instrText>
+              <w:instrText xml:space="preserve"> PAGEREF _Toc230180011 \h </w:instrText>
             </w:r>
             <w:r>
               <w:rPr>
@@ -5182,7 +5182,7 @@
                 <w:noProof/>
                 <w:webHidden/>
               </w:rPr>
-              <w:t>10</w:t>
+              <w:t>11</w:t>
             </w:r>
             <w:r>
               <w:rPr>
@@ -5209,7 +5209,7 @@
               <w14:ligatures w14:val="standardContextual"/>
             </w:rPr>
           </w:pPr>
-          <w:hyperlink w:anchor="_Toc230160340" w:history="1">
+          <w:hyperlink w:anchor="_Toc230180012" w:history="1">
             <w:r>
               <w:rPr>
                 <w:rStyle w:val="Hyperlink"/>
@@ -5236,7 +5236,7 @@
                 <w:noProof/>
                 <w:webHidden/>
               </w:rPr>
-              <w:instrText xml:space="preserve"> PAGEREF _Toc230160340 \h </w:instrText>
+              <w:instrText xml:space="preserve"> PAGEREF _Toc230180012 \h </w:instrText>
             </w:r>
             <w:r>
               <w:rPr>
@@ -5256,7 +5256,7 @@
                 <w:noProof/>
                 <w:webHidden/>
               </w:rPr>
-              <w:t>10</w:t>
+              <w:t>11</w:t>
             </w:r>
             <w:r>
               <w:rPr>
@@ -5284,7 +5284,7 @@
               <w14:ligatures w14:val="standardContextual"/>
             </w:rPr>
           </w:pPr>
-          <w:hyperlink w:anchor="_Toc230160341" w:history="1">
+          <w:hyperlink w:anchor="_Toc230180013" w:history="1">
             <w:r>
               <w:rPr>
                 <w:rStyle w:val="Hyperlink"/>
@@ -5332,7 +5332,7 @@
                 <w:noProof/>
                 <w:webHidden/>
               </w:rPr>
-              <w:instrText xml:space="preserve"> PAGEREF _Toc230160341 \h </w:instrText>
+              <w:instrText xml:space="preserve"> PAGEREF _Toc230180013 \h </w:instrText>
             </w:r>
             <w:r>
               <w:rPr>
@@ -5352,7 +5352,195 @@
                 <w:noProof/>
                 <w:webHidden/>
               </w:rPr>
-              <w:t>11</w:t>
+              <w:t>12</w:t>
+            </w:r>
+            <w:r>
+              <w:rPr>
+                <w:noProof/>
+                <w:webHidden/>
+              </w:rPr>
+              <w:fldChar w:fldCharType="end"/>
+            </w:r>
+          </w:hyperlink>
+        </w:p>
+        <w:p>
+          <w:pPr>
+            <w:pStyle w:val="Verzeichnis3"/>
+            <w:tabs>
+              <w:tab w:val="left" w:pos="1200"/>
+              <w:tab w:val="right" w:leader="dot" w:pos="9062"/>
+            </w:tabs>
+            <w:rPr>
+              <w:rFonts w:eastAsiaTheme="minorEastAsia"/>
+              <w:noProof/>
+              <w:kern w:val="2"/>
+              <w:sz w:val="24"/>
+              <w:szCs w:val="24"/>
+              <w:lang w:val="de-AT" w:eastAsia="de-AT"/>
+              <w14:ligatures w14:val="standardContextual"/>
+            </w:rPr>
+          </w:pPr>
+          <w:hyperlink w:anchor="_Toc230180014" w:history="1">
+            <w:r>
+              <w:rPr>
+                <w:rStyle w:val="Hyperlink"/>
+                <w:noProof/>
+              </w:rPr>
+              <w:t>7.3.1</w:t>
+            </w:r>
+            <w:r>
+              <w:rPr>
+                <w:rFonts w:eastAsiaTheme="minorEastAsia"/>
+                <w:noProof/>
+                <w:kern w:val="2"/>
+                <w:sz w:val="24"/>
+                <w:szCs w:val="24"/>
+                <w:lang w:val="de-AT" w:eastAsia="de-AT"/>
+                <w14:ligatures w14:val="standardContextual"/>
+              </w:rPr>
+              <w:tab/>
+            </w:r>
+            <w:r>
+              <w:rPr>
+                <w:rStyle w:val="Hyperlink"/>
+                <w:noProof/>
+              </w:rPr>
+              <w:t>Risikoanalyse</w:t>
+            </w:r>
+            <w:r>
+              <w:rPr>
+                <w:noProof/>
+                <w:webHidden/>
+              </w:rPr>
+              <w:tab/>
+            </w:r>
+            <w:r>
+              <w:rPr>
+                <w:noProof/>
+                <w:webHidden/>
+              </w:rPr>
+              <w:fldChar w:fldCharType="begin"/>
+            </w:r>
+            <w:r>
+              <w:rPr>
+                <w:noProof/>
+                <w:webHidden/>
+              </w:rPr>
+              <w:instrText xml:space="preserve"> PAGEREF _Toc230180014 \h </w:instrText>
+            </w:r>
+            <w:r>
+              <w:rPr>
+                <w:noProof/>
+                <w:webHidden/>
+              </w:rPr>
+            </w:r>
+            <w:r>
+              <w:rPr>
+                <w:noProof/>
+                <w:webHidden/>
+              </w:rPr>
+              <w:fldChar w:fldCharType="separate"/>
+            </w:r>
+            <w:r>
+              <w:rPr>
+                <w:noProof/>
+                <w:webHidden/>
+              </w:rPr>
+              <w:t>12</w:t>
+            </w:r>
+            <w:r>
+              <w:rPr>
+                <w:noProof/>
+                <w:webHidden/>
+              </w:rPr>
+              <w:fldChar w:fldCharType="end"/>
+            </w:r>
+          </w:hyperlink>
+        </w:p>
+        <w:p>
+          <w:pPr>
+            <w:pStyle w:val="Verzeichnis3"/>
+            <w:tabs>
+              <w:tab w:val="left" w:pos="1200"/>
+              <w:tab w:val="right" w:leader="dot" w:pos="9062"/>
+            </w:tabs>
+            <w:rPr>
+              <w:rFonts w:eastAsiaTheme="minorEastAsia"/>
+              <w:noProof/>
+              <w:kern w:val="2"/>
+              <w:sz w:val="24"/>
+              <w:szCs w:val="24"/>
+              <w:lang w:val="de-AT" w:eastAsia="de-AT"/>
+              <w14:ligatures w14:val="standardContextual"/>
+            </w:rPr>
+          </w:pPr>
+          <w:hyperlink w:anchor="_Toc230180015" w:history="1">
+            <w:r>
+              <w:rPr>
+                <w:rStyle w:val="Hyperlink"/>
+                <w:noProof/>
+              </w:rPr>
+              <w:t>7.3.2</w:t>
+            </w:r>
+            <w:r>
+              <w:rPr>
+                <w:rFonts w:eastAsiaTheme="minorEastAsia"/>
+                <w:noProof/>
+                <w:kern w:val="2"/>
+                <w:sz w:val="24"/>
+                <w:szCs w:val="24"/>
+                <w:lang w:val="de-AT" w:eastAsia="de-AT"/>
+                <w14:ligatures w14:val="standardContextual"/>
+              </w:rPr>
+              <w:tab/>
+            </w:r>
+            <w:r>
+              <w:rPr>
+                <w:rStyle w:val="Hyperlink"/>
+                <w:noProof/>
+              </w:rPr>
+              <w:t>Risikomatrix</w:t>
+            </w:r>
+            <w:r>
+              <w:rPr>
+                <w:noProof/>
+                <w:webHidden/>
+              </w:rPr>
+              <w:tab/>
+            </w:r>
+            <w:r>
+              <w:rPr>
+                <w:noProof/>
+                <w:webHidden/>
+              </w:rPr>
+              <w:fldChar w:fldCharType="begin"/>
+            </w:r>
+            <w:r>
+              <w:rPr>
+                <w:noProof/>
+                <w:webHidden/>
+              </w:rPr>
+              <w:instrText xml:space="preserve"> PAGEREF _Toc230180015 \h </w:instrText>
+            </w:r>
+            <w:r>
+              <w:rPr>
+                <w:noProof/>
+                <w:webHidden/>
+              </w:rPr>
+            </w:r>
+            <w:r>
+              <w:rPr>
+                <w:noProof/>
+                <w:webHidden/>
+              </w:rPr>
+              <w:fldChar w:fldCharType="separate"/>
+            </w:r>
+            <w:r>
+              <w:rPr>
+                <w:noProof/>
+                <w:webHidden/>
+              </w:rPr>
+              <w:t>13</w:t>
             </w:r>
             <w:r>
               <w:rPr>
@@ -5380,7 +5568,7 @@
               <w14:ligatures w14:val="standardContextual"/>
             </w:rPr>
           </w:pPr>
-          <w:hyperlink w:anchor="_Toc230160342" w:history="1">
+          <w:hyperlink w:anchor="_Toc230180016" w:history="1">
             <w:r>
               <w:rPr>
                 <w:rStyle w:val="Hyperlink"/>
@@ -5428,7 +5616,7 @@
                 <w:noProof/>
                 <w:webHidden/>
               </w:rPr>
-              <w:instrText xml:space="preserve"> PAGEREF _Toc230160342 \h </w:instrText>
+              <w:instrText xml:space="preserve"> PAGEREF _Toc230180016 \h </w:instrText>
             </w:r>
             <w:r>
               <w:rPr>
@@ -5448,7 +5636,7 @@
                 <w:noProof/>
                 <w:webHidden/>
               </w:rPr>
-              <w:t>11</w:t>
+              <w:t>14</w:t>
             </w:r>
             <w:r>
               <w:rPr>
@@ -5475,13 +5663,13 @@
               <w14:ligatures w14:val="standardContextual"/>
             </w:rPr>
           </w:pPr>
-          <w:hyperlink w:anchor="_Toc230160343" w:history="1">
+          <w:hyperlink w:anchor="_Toc230180017" w:history="1">
             <w:r>
               <w:rPr>
                 <w:rStyle w:val="Hyperlink"/>
                 <w:noProof/>
               </w:rPr>
-              <w:t>6.4.1 Qualitätsanforderungen:</w:t>
+              <w:t>7.4.1 Qualitätsanforderungen:</w:t>
             </w:r>
             <w:r>
               <w:rPr>
@@ -5502,7 +5690,7 @@
                 <w:noProof/>
                 <w:webHidden/>
               </w:rPr>
-              <w:instrText xml:space="preserve"> PAGEREF _Toc230160343 \h </w:instrText>
+              <w:instrText xml:space="preserve"> PAGEREF _Toc230180017 \h </w:instrText>
             </w:r>
             <w:r>
               <w:rPr>
@@ -5522,7 +5710,7 @@
                 <w:noProof/>
                 <w:webHidden/>
               </w:rPr>
-              <w:t>11</w:t>
+              <w:t>14</w:t>
             </w:r>
             <w:r>
               <w:rPr>
@@ -5549,13 +5737,13 @@
               <w14:ligatures w14:val="standardContextual"/>
             </w:rPr>
           </w:pPr>
-          <w:hyperlink w:anchor="_Toc230160344" w:history="1">
+          <w:hyperlink w:anchor="_Toc230180018" w:history="1">
             <w:r>
               <w:rPr>
                 <w:rStyle w:val="Hyperlink"/>
                 <w:noProof/>
               </w:rPr>
-              <w:t>6.4.1 Qualitätssicherung:</w:t>
+              <w:t>7.4.1 Qualitätssicherung:</w:t>
             </w:r>
             <w:r>
               <w:rPr>
@@ -5576,7 +5764,7 @@
                 <w:noProof/>
                 <w:webHidden/>
               </w:rPr>
-              <w:instrText xml:space="preserve"> PAGEREF _Toc230160344 \h </w:instrText>
+              <w:instrText xml:space="preserve"> PAGEREF _Toc230180018 \h </w:instrText>
             </w:r>
             <w:r>
               <w:rPr>
@@ -5596,7 +5784,7 @@
                 <w:noProof/>
                 <w:webHidden/>
               </w:rPr>
-              <w:t>11</w:t>
+              <w:t>14</w:t>
             </w:r>
             <w:r>
               <w:rPr>
@@ -5624,7 +5812,7 @@
               <w14:ligatures w14:val="standardContextual"/>
             </w:rPr>
           </w:pPr>
-          <w:hyperlink w:anchor="_Toc230160345" w:history="1">
+          <w:hyperlink w:anchor="_Toc230180019" w:history="1">
             <w:r>
               <w:rPr>
                 <w:rStyle w:val="Hyperlink"/>
@@ -5672,7 +5860,7 @@
                 <w:noProof/>
                 <w:webHidden/>
               </w:rPr>
-              <w:instrText xml:space="preserve"> PAGEREF _Toc230160345 \h </w:instrText>
+              <w:instrText xml:space="preserve"> PAGEREF _Toc230180019 \h </w:instrText>
             </w:r>
             <w:r>
               <w:rPr>
@@ -5692,7 +5880,7 @@
                 <w:noProof/>
                 <w:webHidden/>
               </w:rPr>
-              <w:t>11</w:t>
+              <w:t>14</w:t>
             </w:r>
             <w:r>
               <w:rPr>
@@ -5720,7 +5908,7 @@
               <w14:ligatures w14:val="standardContextual"/>
             </w:rPr>
           </w:pPr>
-          <w:hyperlink w:anchor="_Toc230160346" w:history="1">
+          <w:hyperlink w:anchor="_Toc230180020" w:history="1">
             <w:r>
               <w:rPr>
                 <w:rStyle w:val="Hyperlink"/>
@@ -5768,7 +5956,7 @@
                 <w:noProof/>
                 <w:webHidden/>
               </w:rPr>
-              <w:instrText xml:space="preserve"> PAGEREF _Toc230160346 \h </w:instrText>
+              <w:instrText xml:space="preserve"> PAGEREF _Toc230180020 \h </w:instrText>
             </w:r>
             <w:r>
               <w:rPr>
@@ -5788,7 +5976,7 @@
                 <w:noProof/>
                 <w:webHidden/>
               </w:rPr>
-              <w:t>11</w:t>
+              <w:t>14</w:t>
             </w:r>
             <w:r>
               <w:rPr>
@@ -5816,7 +6004,7 @@
               <w14:ligatures w14:val="standardContextual"/>
             </w:rPr>
           </w:pPr>
-          <w:hyperlink w:anchor="_Toc230160347" w:history="1">
+          <w:hyperlink w:anchor="_Toc230180021" w:history="1">
             <w:r>
               <w:rPr>
                 <w:rStyle w:val="Hyperlink"/>
@@ -5864,7 +6052,7 @@
                 <w:noProof/>
                 <w:webHidden/>
               </w:rPr>
-              <w:instrText xml:space="preserve"> PAGEREF _Toc230160347 \h </w:instrText>
+              <w:instrText xml:space="preserve"> PAGEREF _Toc230180021 \h </w:instrText>
             </w:r>
             <w:r>
               <w:rPr>
@@ -5884,7 +6072,7 @@
                 <w:noProof/>
                 <w:webHidden/>
               </w:rPr>
-              <w:t>11</w:t>
+              <w:t>14</w:t>
             </w:r>
             <w:r>
               <w:rPr>
@@ -5912,7 +6100,7 @@
               <w14:ligatures w14:val="standardContextual"/>
             </w:rPr>
           </w:pPr>
-          <w:hyperlink w:anchor="_Toc230160348" w:history="1">
+          <w:hyperlink w:anchor="_Toc230180022" w:history="1">
             <w:r>
               <w:rPr>
                 <w:rStyle w:val="Hyperlink"/>
@@ -5960,7 +6148,7 @@
                 <w:noProof/>
                 <w:webHidden/>
               </w:rPr>
-              <w:instrText xml:space="preserve"> PAGEREF _Toc230160348 \h </w:instrText>
+              <w:instrText xml:space="preserve"> PAGEREF _Toc230180022 \h </w:instrText>
             </w:r>
             <w:r>
               <w:rPr>
@@ -5980,7 +6168,7 @@
                 <w:noProof/>
                 <w:webHidden/>
               </w:rPr>
-              <w:t>12</w:t>
+              <w:t>15</w:t>
             </w:r>
             <w:r>
               <w:rPr>
@@ -6022,7 +6210,7 @@
           <w:rFonts w:ascii="Arial" w:hAnsi="Arial" w:cs="Arial"/>
         </w:rPr>
       </w:pPr>
-      <w:bookmarkStart w:id="0" w:name="_Toc230160297"/>
+      <w:bookmarkStart w:id="0" w:name="_Toc230179969"/>
       <w:r>
         <w:rPr>
           <w:rFonts w:ascii="Arial" w:hAnsi="Arial" w:cs="Arial"/>
@@ -6290,7 +6478,7 @@
           <w:rFonts w:ascii="Arial" w:hAnsi="Arial" w:cs="Arial"/>
         </w:rPr>
       </w:pPr>
-      <w:bookmarkStart w:id="1" w:name="_Toc230160298"/>
+      <w:bookmarkStart w:id="1" w:name="_Toc230179970"/>
       <w:r>
         <w:rPr>
           <w:rFonts w:ascii="Arial" w:hAnsi="Arial" w:cs="Arial"/>
@@ -6311,7 +6499,7 @@
           <w:rFonts w:ascii="Arial" w:hAnsi="Arial" w:cs="Arial"/>
         </w:rPr>
       </w:pPr>
-      <w:bookmarkStart w:id="2" w:name="_Toc230160299"/>
+      <w:bookmarkStart w:id="2" w:name="_Toc230179971"/>
       <w:r>
         <w:rPr>
           <w:rFonts w:ascii="Arial" w:hAnsi="Arial" w:cs="Arial"/>
@@ -6403,7 +6591,7 @@
           <w:rFonts w:ascii="Arial" w:hAnsi="Arial" w:cs="Arial"/>
         </w:rPr>
       </w:pPr>
-      <w:bookmarkStart w:id="3" w:name="_Toc230160300"/>
+      <w:bookmarkStart w:id="3" w:name="_Toc230179972"/>
       <w:r>
         <w:rPr>
           <w:rFonts w:ascii="Arial" w:hAnsi="Arial" w:cs="Arial"/>
@@ -6518,7 +6706,7 @@
           <w:rFonts w:ascii="Arial" w:hAnsi="Arial" w:cs="Arial"/>
         </w:rPr>
       </w:pPr>
-      <w:bookmarkStart w:id="4" w:name="_Toc230160301"/>
+      <w:bookmarkStart w:id="4" w:name="_Toc230179973"/>
       <w:r>
         <w:rPr>
           <w:rFonts w:ascii="Arial" w:hAnsi="Arial" w:cs="Arial"/>
@@ -6569,7 +6757,7 @@
           <w:rFonts w:ascii="Arial" w:hAnsi="Arial" w:cs="Arial"/>
         </w:rPr>
       </w:pPr>
-      <w:bookmarkStart w:id="5" w:name="_Toc230160302"/>
+      <w:bookmarkStart w:id="5" w:name="_Toc230179974"/>
       <w:r>
         <w:rPr>
           <w:rFonts w:ascii="Arial" w:hAnsi="Arial" w:cs="Arial"/>
@@ -6726,7 +6914,7 @@
           <w:rFonts w:ascii="Arial" w:hAnsi="Arial" w:cs="Arial"/>
         </w:rPr>
       </w:pPr>
-      <w:bookmarkStart w:id="6" w:name="_Toc230160303"/>
+      <w:bookmarkStart w:id="6" w:name="_Toc230179975"/>
       <w:r>
         <w:rPr>
           <w:rFonts w:ascii="Arial" w:hAnsi="Arial" w:cs="Arial"/>
@@ -7164,7 +7352,7 @@
           <w:rFonts w:ascii="Arial" w:hAnsi="Arial" w:cs="Arial"/>
         </w:rPr>
       </w:pPr>
-      <w:bookmarkStart w:id="7" w:name="_Toc230160304"/>
+      <w:bookmarkStart w:id="7" w:name="_Toc230179976"/>
       <w:r>
         <w:rPr>
           <w:rFonts w:ascii="Arial" w:hAnsi="Arial" w:cs="Arial"/>
@@ -7338,7 +7526,7 @@
           <w:rFonts w:ascii="Arial" w:hAnsi="Arial" w:cs="Arial"/>
         </w:rPr>
       </w:pPr>
-      <w:bookmarkStart w:id="8" w:name="_Toc230160305"/>
+      <w:bookmarkStart w:id="8" w:name="_Toc230179977"/>
       <w:r>
         <w:rPr>
           <w:rFonts w:ascii="Arial" w:hAnsi="Arial" w:cs="Arial"/>
@@ -7379,7 +7567,7 @@
           <w:rFonts w:ascii="Arial" w:hAnsi="Arial" w:cs="Arial"/>
         </w:rPr>
       </w:pPr>
-      <w:bookmarkStart w:id="9" w:name="_Toc230160306"/>
+      <w:bookmarkStart w:id="9" w:name="_Toc230179978"/>
       <w:r>
         <w:rPr>
           <w:rFonts w:ascii="Arial" w:hAnsi="Arial" w:cs="Arial"/>
@@ -7628,7 +7816,7 @@
           <w:rFonts w:ascii="Arial" w:hAnsi="Arial" w:cs="Arial"/>
         </w:rPr>
       </w:pPr>
-      <w:bookmarkStart w:id="10" w:name="_Toc230160307"/>
+      <w:bookmarkStart w:id="10" w:name="_Toc230179979"/>
       <w:r>
         <w:rPr>
           <w:rFonts w:ascii="Arial" w:hAnsi="Arial" w:cs="Arial"/>
@@ -7776,7 +7964,7 @@
           <w:rFonts w:ascii="Arial" w:hAnsi="Arial" w:cs="Arial"/>
         </w:rPr>
       </w:pPr>
-      <w:bookmarkStart w:id="11" w:name="_Toc230160308"/>
+      <w:bookmarkStart w:id="11" w:name="_Toc230179980"/>
       <w:r>
         <w:rPr>
           <w:rFonts w:ascii="Arial" w:hAnsi="Arial" w:cs="Arial"/>
@@ -7956,7 +8144,7 @@
           <w:rFonts w:ascii="Arial" w:hAnsi="Arial" w:cs="Arial"/>
         </w:rPr>
       </w:pPr>
-      <w:bookmarkStart w:id="12" w:name="_Toc230160309"/>
+      <w:bookmarkStart w:id="12" w:name="_Toc230179981"/>
       <w:r>
         <w:rPr>
           <w:rFonts w:ascii="Arial" w:hAnsi="Arial" w:cs="Arial"/>
@@ -8032,7 +8220,7 @@
           <w:rFonts w:ascii="Arial" w:hAnsi="Arial" w:cs="Arial"/>
         </w:rPr>
       </w:pPr>
-      <w:bookmarkStart w:id="13" w:name="_Toc230160310"/>
+      <w:bookmarkStart w:id="13" w:name="_Toc230179982"/>
       <w:r>
         <w:rPr>
           <w:rFonts w:ascii="Arial" w:hAnsi="Arial" w:cs="Arial"/>
@@ -8181,7 +8369,7 @@
           <w:rFonts w:ascii="Arial" w:hAnsi="Arial" w:cs="Arial"/>
         </w:rPr>
       </w:pPr>
-      <w:bookmarkStart w:id="14" w:name="_Toc230160311"/>
+      <w:bookmarkStart w:id="14" w:name="_Toc230179983"/>
       <w:r>
         <w:rPr>
           <w:rFonts w:ascii="Arial" w:hAnsi="Arial" w:cs="Arial"/>
@@ -8398,7 +8586,7 @@
           <w:rFonts w:ascii="Arial" w:hAnsi="Arial" w:cs="Arial"/>
         </w:rPr>
       </w:pPr>
-      <w:bookmarkStart w:id="15" w:name="_Toc230160312"/>
+      <w:bookmarkStart w:id="15" w:name="_Toc230179984"/>
       <w:r>
         <w:rPr>
           <w:rFonts w:ascii="Arial" w:hAnsi="Arial" w:cs="Arial"/>
@@ -8626,7 +8814,7 @@
           <w:rFonts w:ascii="Arial" w:hAnsi="Arial" w:cs="Arial"/>
         </w:rPr>
       </w:pPr>
-      <w:bookmarkStart w:id="16" w:name="_Toc230160313"/>
+      <w:bookmarkStart w:id="16" w:name="_Toc230179985"/>
       <w:r>
         <w:rPr>
           <w:rFonts w:ascii="Arial" w:hAnsi="Arial" w:cs="Arial"/>
@@ -8826,7 +9014,7 @@
           <w:rFonts w:ascii="Arial" w:hAnsi="Arial" w:cs="Arial"/>
         </w:rPr>
       </w:pPr>
-      <w:bookmarkStart w:id="17" w:name="_Toc230160314"/>
+      <w:bookmarkStart w:id="17" w:name="_Toc230179986"/>
       <w:r>
         <w:rPr>
           <w:rFonts w:ascii="Arial" w:hAnsi="Arial" w:cs="Arial"/>
@@ -8949,7 +9137,7 @@
           <w:rFonts w:ascii="Arial" w:hAnsi="Arial" w:cs="Arial"/>
         </w:rPr>
       </w:pPr>
-      <w:bookmarkStart w:id="18" w:name="_Toc230160315"/>
+      <w:bookmarkStart w:id="18" w:name="_Toc230179987"/>
       <w:r>
         <w:rPr>
           <w:rFonts w:ascii="Arial" w:hAnsi="Arial" w:cs="Arial"/>
@@ -8970,7 +9158,7 @@
           <w:rFonts w:ascii="Arial" w:hAnsi="Arial" w:cs="Arial"/>
         </w:rPr>
       </w:pPr>
-      <w:bookmarkStart w:id="19" w:name="_Toc230160316"/>
+      <w:bookmarkStart w:id="19" w:name="_Toc230179988"/>
       <w:r>
         <w:rPr>
           <w:rFonts w:ascii="Arial" w:hAnsi="Arial" w:cs="Arial"/>
@@ -9007,7 +9195,7 @@
       <w:pPr>
         <w:pStyle w:val="berschrift3"/>
       </w:pPr>
-      <w:bookmarkStart w:id="20" w:name="_Toc230160317"/>
+      <w:bookmarkStart w:id="20" w:name="_Toc230179989"/>
       <w:r>
         <w:t>5.1.1 Funktionen:</w:t>
       </w:r>
@@ -9071,7 +9259,7 @@
       <w:pPr>
         <w:pStyle w:val="berschrift3"/>
       </w:pPr>
-      <w:bookmarkStart w:id="21" w:name="_Toc230160318"/>
+      <w:bookmarkStart w:id="21" w:name="_Toc230179990"/>
       <w:r>
         <w:t>5.1.2 Beschreibung:</w:t>
       </w:r>
@@ -9190,7 +9378,7 @@
           <w:rFonts w:ascii="Arial" w:hAnsi="Arial" w:cs="Arial"/>
         </w:rPr>
       </w:pPr>
-      <w:bookmarkStart w:id="22" w:name="_Toc230160319"/>
+      <w:bookmarkStart w:id="22" w:name="_Toc230179991"/>
       <w:r>
         <w:rPr>
           <w:rFonts w:ascii="Arial" w:hAnsi="Arial" w:cs="Arial"/>
@@ -9209,7 +9397,7 @@
       <w:pPr>
         <w:pStyle w:val="berschrift3"/>
       </w:pPr>
-      <w:bookmarkStart w:id="23" w:name="_Toc230160320"/>
+      <w:bookmarkStart w:id="23" w:name="_Toc230179992"/>
       <w:r>
         <w:t>5.2.1 Funktionen:</w:t>
       </w:r>
@@ -9309,7 +9497,7 @@
       <w:pPr>
         <w:pStyle w:val="berschrift3"/>
       </w:pPr>
-      <w:bookmarkStart w:id="24" w:name="_Toc230160321"/>
+      <w:bookmarkStart w:id="24" w:name="_Toc230179993"/>
       <w:r>
         <w:t>5.2.2 Beschreibung:</w:t>
       </w:r>
@@ -9431,7 +9619,7 @@
           <w:rFonts w:ascii="Arial" w:hAnsi="Arial" w:cs="Arial"/>
         </w:rPr>
       </w:pPr>
-      <w:bookmarkStart w:id="25" w:name="_Toc230160322"/>
+      <w:bookmarkStart w:id="25" w:name="_Toc230179994"/>
       <w:r>
         <w:rPr>
           <w:rFonts w:ascii="Arial" w:hAnsi="Arial" w:cs="Arial"/>
@@ -9445,7 +9633,7 @@
       <w:pPr>
         <w:pStyle w:val="berschrift3"/>
       </w:pPr>
-      <w:bookmarkStart w:id="26" w:name="_Toc230160323"/>
+      <w:bookmarkStart w:id="26" w:name="_Toc230179995"/>
       <w:r>
         <w:t>5.3.1 Funktionen:</w:t>
       </w:r>
@@ -9664,7 +9852,7 @@
       <w:pPr>
         <w:pStyle w:val="berschrift3"/>
       </w:pPr>
-      <w:bookmarkStart w:id="27" w:name="_Toc230160324"/>
+      <w:bookmarkStart w:id="27" w:name="_Toc230179996"/>
       <w:r>
         <w:t>5.3.2 Beschreibung:</w:t>
       </w:r>
@@ -9734,7 +9922,7 @@
           <w:rFonts w:ascii="Arial" w:hAnsi="Arial" w:cs="Arial"/>
         </w:rPr>
       </w:pPr>
-      <w:bookmarkStart w:id="28" w:name="_Toc230160325"/>
+      <w:bookmarkStart w:id="28" w:name="_Toc230179997"/>
       <w:r>
         <w:rPr>
           <w:rFonts w:ascii="Arial" w:hAnsi="Arial" w:cs="Arial"/>
@@ -9747,7 +9935,7 @@
       <w:pPr>
         <w:pStyle w:val="berschrift3"/>
       </w:pPr>
-      <w:bookmarkStart w:id="29" w:name="_Toc230160326"/>
+      <w:bookmarkStart w:id="29" w:name="_Toc230179998"/>
       <w:r>
         <w:t>5.4.1 Funktionen:</w:t>
       </w:r>
@@ -10000,7 +10188,7 @@
       <w:pPr>
         <w:pStyle w:val="berschrift3"/>
       </w:pPr>
-      <w:bookmarkStart w:id="30" w:name="_Toc230160327"/>
+      <w:bookmarkStart w:id="30" w:name="_Toc230179999"/>
       <w:r>
         <w:t>5.4.2 Beschreibung:</w:t>
       </w:r>
@@ -10107,7 +10295,7 @@
           <w:rFonts w:ascii="Arial" w:hAnsi="Arial" w:cs="Arial"/>
         </w:rPr>
       </w:pPr>
-      <w:bookmarkStart w:id="31" w:name="_Toc230160328"/>
+      <w:bookmarkStart w:id="31" w:name="_Toc230180000"/>
       <w:r>
         <w:rPr>
           <w:rFonts w:ascii="Arial" w:hAnsi="Arial" w:cs="Arial"/>
@@ -10121,7 +10309,7 @@
       <w:pPr>
         <w:pStyle w:val="berschrift3"/>
       </w:pPr>
-      <w:bookmarkStart w:id="32" w:name="_Toc230160329"/>
+      <w:bookmarkStart w:id="32" w:name="_Toc230180001"/>
       <w:r>
         <w:t>5.5.1 Funktionen:</w:t>
       </w:r>
@@ -10271,7 +10459,7 @@
       <w:pPr>
         <w:pStyle w:val="berschrift3"/>
       </w:pPr>
-      <w:bookmarkStart w:id="33" w:name="_Toc230160330"/>
+      <w:bookmarkStart w:id="33" w:name="_Toc230180002"/>
       <w:r>
         <w:t>5.5.2 Beschreibung:</w:t>
       </w:r>
@@ -10671,7 +10859,7 @@
           <w:rFonts w:ascii="Arial" w:hAnsi="Arial" w:cs="Arial"/>
         </w:rPr>
       </w:pPr>
-      <w:bookmarkStart w:id="34" w:name="_Toc230160331"/>
+      <w:bookmarkStart w:id="34" w:name="_Toc230180003"/>
       <w:r>
         <w:rPr>
           <w:rFonts w:ascii="Arial" w:hAnsi="Arial" w:cs="Arial"/>
@@ -10685,7 +10873,7 @@
       <w:pPr>
         <w:pStyle w:val="berschrift3"/>
       </w:pPr>
-      <w:bookmarkStart w:id="35" w:name="_Toc230160332"/>
+      <w:bookmarkStart w:id="35" w:name="_Toc230180004"/>
       <w:r>
         <w:t>5.6.1 Funktionen:</w:t>
       </w:r>
@@ -10956,7 +11144,7 @@
       <w:pPr>
         <w:pStyle w:val="berschrift3"/>
       </w:pPr>
-      <w:bookmarkStart w:id="36" w:name="_Toc230160333"/>
+      <w:bookmarkStart w:id="36" w:name="_Toc230180005"/>
       <w:r>
         <w:t>5.6.2 Beschreibung:</w:t>
       </w:r>
@@ -11292,7 +11480,7 @@
           <w:rFonts w:ascii="Arial" w:hAnsi="Arial" w:cs="Arial"/>
         </w:rPr>
       </w:pPr>
-      <w:bookmarkStart w:id="37" w:name="_Toc230160334"/>
+      <w:bookmarkStart w:id="37" w:name="_Toc230180006"/>
       <w:r>
         <w:rPr>
           <w:rFonts w:ascii="Arial" w:hAnsi="Arial" w:cs="Arial"/>
@@ -11396,7 +11584,7 @@
           <w:rFonts w:ascii="Arial" w:hAnsi="Arial" w:cs="Arial"/>
         </w:rPr>
       </w:pPr>
-      <w:bookmarkStart w:id="38" w:name="_Toc230160335"/>
+      <w:bookmarkStart w:id="38" w:name="_Toc230180007"/>
       <w:r>
         <w:rPr>
           <w:rFonts w:ascii="Arial" w:hAnsi="Arial" w:cs="Arial"/>
@@ -11448,7 +11636,7 @@
           <w:rFonts w:ascii="Arial" w:hAnsi="Arial" w:cs="Arial"/>
         </w:rPr>
       </w:pPr>
-      <w:bookmarkStart w:id="39" w:name="_Toc230160336"/>
+      <w:bookmarkStart w:id="39" w:name="_Toc230180008"/>
       <w:r>
         <w:rPr>
           <w:rFonts w:ascii="Arial" w:hAnsi="Arial" w:cs="Arial"/>
@@ -11703,7 +11891,7 @@
           <w:rFonts w:ascii="Arial" w:hAnsi="Arial" w:cs="Arial"/>
         </w:rPr>
       </w:pPr>
-      <w:bookmarkStart w:id="40" w:name="_Toc230160337"/>
+      <w:bookmarkStart w:id="40" w:name="_Toc230180009"/>
       <w:r>
         <w:rPr>
           <w:rFonts w:ascii="Arial" w:hAnsi="Arial" w:cs="Arial"/>
@@ -11716,7 +11904,7 @@
       <w:pPr>
         <w:pStyle w:val="berschrift3"/>
       </w:pPr>
-      <w:bookmarkStart w:id="41" w:name="_Toc230160338"/>
+      <w:bookmarkStart w:id="41" w:name="_Toc230180010"/>
       <w:r>
         <w:t>6.6.1 Hardware:</w:t>
       </w:r>
@@ -11792,7 +11980,7 @@
       <w:pPr>
         <w:pStyle w:val="berschrift3"/>
       </w:pPr>
-      <w:bookmarkStart w:id="42" w:name="_Toc230160339"/>
+      <w:bookmarkStart w:id="42" w:name="_Toc230180011"/>
       <w:r>
         <w:t>6.6.2 Software:</w:t>
       </w:r>
@@ -12062,7 +12250,7 @@
       <w:pPr>
         <w:pStyle w:val="berschrift3"/>
       </w:pPr>
-      <w:bookmarkStart w:id="43" w:name="_Toc230160340"/>
+      <w:bookmarkStart w:id="43" w:name="_Toc230180012"/>
       <w:r>
         <w:t>6.6.</w:t>
       </w:r>
@@ -12152,7 +12340,7 @@
           <w:rFonts w:ascii="Arial" w:hAnsi="Arial" w:cs="Arial"/>
         </w:rPr>
       </w:pPr>
-      <w:bookmarkStart w:id="44" w:name="_Toc230160341"/>
+      <w:bookmarkStart w:id="44" w:name="_Toc230180013"/>
       <w:r>
         <w:rPr>
           <w:rFonts w:ascii="Arial" w:hAnsi="Arial" w:cs="Arial"/>
@@ -12170,9 +12358,11 @@
           <w:numId w:val="2"/>
         </w:numPr>
       </w:pPr>
+      <w:bookmarkStart w:id="45" w:name="_Toc230180014"/>
       <w:r>
         <w:t>Risikoanalyse</w:t>
       </w:r>
+      <w:bookmarkEnd w:id="45"/>
       <w:r>
         <w:br/>
       </w:r>
@@ -12225,10 +12415,12 @@
           <w:numId w:val="2"/>
         </w:numPr>
       </w:pPr>
+      <w:bookmarkStart w:id="46" w:name="_Toc230180015"/>
       <w:r>
         <w:lastRenderedPageBreak/>
         <w:t>Risikomatrix</w:t>
       </w:r>
+      <w:bookmarkEnd w:id="46"/>
       <w:r>
         <w:br/>
       </w:r>
@@ -12341,7 +12533,7 @@
           <w:rFonts w:ascii="Arial" w:hAnsi="Arial" w:cs="Arial"/>
         </w:rPr>
       </w:pPr>
-      <w:bookmarkStart w:id="45" w:name="_Toc230160342"/>
+      <w:bookmarkStart w:id="47" w:name="_Toc230180016"/>
       <w:r>
         <w:rPr>
           <w:rFonts w:ascii="Arial" w:hAnsi="Arial" w:cs="Arial"/>
@@ -12349,7 +12541,7 @@
         <w:lastRenderedPageBreak/>
         <w:t>Qualität</w:t>
       </w:r>
-      <w:bookmarkEnd w:id="45"/>
+      <w:bookmarkEnd w:id="47"/>
     </w:p>
     <w:p>
       <w:pPr>
@@ -12370,14 +12562,14 @@
       <w:pPr>
         <w:pStyle w:val="berschrift3"/>
       </w:pPr>
-      <w:bookmarkStart w:id="46" w:name="_Toc230160343"/>
+      <w:bookmarkStart w:id="48" w:name="_Toc230180017"/>
       <w:r>
         <w:t>7</w:t>
       </w:r>
       <w:r>
         <w:t>.4.1 Qualitätsanforderungen:</w:t>
       </w:r>
-      <w:bookmarkEnd w:id="46"/>
+      <w:bookmarkEnd w:id="48"/>
     </w:p>
     <w:p>
       <w:pPr>
@@ -12509,14 +12701,14 @@
       <w:pPr>
         <w:pStyle w:val="berschrift3"/>
       </w:pPr>
-      <w:bookmarkStart w:id="47" w:name="_Toc230160344"/>
+      <w:bookmarkStart w:id="49" w:name="_Toc230180018"/>
       <w:r>
         <w:t>7</w:t>
       </w:r>
       <w:r>
         <w:t>.4.1 Qualitätssicherung:</w:t>
       </w:r>
-      <w:bookmarkEnd w:id="47"/>
+      <w:bookmarkEnd w:id="49"/>
     </w:p>
     <w:p>
       <w:pPr>
@@ -12623,7 +12815,7 @@
           <w:rFonts w:ascii="Arial" w:hAnsi="Arial" w:cs="Arial"/>
         </w:rPr>
       </w:pPr>
-      <w:bookmarkStart w:id="48" w:name="_Toc230160345"/>
+      <w:bookmarkStart w:id="50" w:name="_Toc230180019"/>
       <w:r>
         <w:rPr>
           <w:rFonts w:ascii="Arial" w:hAnsi="Arial" w:cs="Arial"/>
@@ -12636,7 +12828,7 @@
         </w:rPr>
         <w:t>bedingungen</w:t>
       </w:r>
-      <w:bookmarkEnd w:id="48"/>
+      <w:bookmarkEnd w:id="50"/>
     </w:p>
     <w:p>
       <w:pPr>
@@ -12682,14 +12874,14 @@
           <w:rFonts w:ascii="Arial" w:hAnsi="Arial" w:cs="Arial"/>
         </w:rPr>
       </w:pPr>
-      <w:bookmarkStart w:id="49" w:name="_Toc230160346"/>
+      <w:bookmarkStart w:id="51" w:name="_Toc230180020"/>
       <w:r>
         <w:rPr>
           <w:rFonts w:ascii="Arial" w:hAnsi="Arial" w:cs="Arial"/>
         </w:rPr>
         <w:t>Beurteilung</w:t>
       </w:r>
-      <w:bookmarkEnd w:id="49"/>
+      <w:bookmarkEnd w:id="51"/>
     </w:p>
     <w:p>
       <w:pPr>
@@ -12746,14 +12938,14 @@
           <w:rFonts w:ascii="Arial" w:hAnsi="Arial" w:cs="Arial"/>
         </w:rPr>
       </w:pPr>
-      <w:bookmarkStart w:id="50" w:name="_Toc230160347"/>
+      <w:bookmarkStart w:id="52" w:name="_Toc230180021"/>
       <w:r>
         <w:rPr>
           <w:rFonts w:ascii="Arial" w:hAnsi="Arial" w:cs="Arial"/>
         </w:rPr>
         <w:t>Anhang</w:t>
       </w:r>
-      <w:bookmarkEnd w:id="50"/>
+      <w:bookmarkEnd w:id="52"/>
     </w:p>
     <w:p>
       <w:pPr>
@@ -12884,14 +13076,14 @@
         <w:lastRenderedPageBreak/>
         <w:t xml:space="preserve"> </w:t>
       </w:r>
-      <w:bookmarkStart w:id="51" w:name="_Toc230160348"/>
+      <w:bookmarkStart w:id="53" w:name="_Toc230180022"/>
       <w:r>
         <w:rPr>
           <w:rFonts w:ascii="Arial" w:hAnsi="Arial" w:cs="Arial"/>
         </w:rPr>
         <w:t>Vereinbarung</w:t>
       </w:r>
-      <w:bookmarkEnd w:id="51"/>
+      <w:bookmarkEnd w:id="53"/>
     </w:p>
     <w:p>
       <w:pPr>

</xml_diff>

<commit_message>
[LOGIC] Added respsone and request models for Workspace and Chats
</commit_message>
<xml_diff>
--- a/0_Documents/Pflichtenheft.docx
+++ b/0_Documents/Pflichtenheft.docx
@@ -395,13 +395,13 @@
         <w:tblLook w:val="04A0" w:firstRow="1" w:lastRow="0" w:firstColumn="1" w:lastColumn="0" w:noHBand="0" w:noVBand="1"/>
       </w:tblPr>
       <w:tblGrid>
-        <w:gridCol w:w="704"/>
-        <w:gridCol w:w="1276"/>
-        <w:gridCol w:w="992"/>
-        <w:gridCol w:w="1843"/>
-        <w:gridCol w:w="1699"/>
-        <w:gridCol w:w="1328"/>
-        <w:gridCol w:w="1220"/>
+        <w:gridCol w:w="659"/>
+        <w:gridCol w:w="1264"/>
+        <w:gridCol w:w="983"/>
+        <w:gridCol w:w="2084"/>
+        <w:gridCol w:w="1675"/>
+        <w:gridCol w:w="1260"/>
+        <w:gridCol w:w="1137"/>
       </w:tblGrid>
       <w:tr>
         <w:trPr>
@@ -720,7 +720,35 @@
                 <w:rFonts w:ascii="Arial" w:hAnsi="Arial" w:cs="Arial"/>
                 <w:sz w:val="20"/>
               </w:rPr>
-              <w:t>User/Friendship-system</w:t>
+              <w:t>User</w:t>
+            </w:r>
+            <w:r>
+              <w:rPr>
+                <w:rFonts w:ascii="Arial" w:hAnsi="Arial" w:cs="Arial"/>
+                <w:sz w:val="20"/>
+              </w:rPr>
+              <w:t xml:space="preserve"> </w:t>
+            </w:r>
+            <w:r>
+              <w:rPr>
+                <w:rFonts w:ascii="Arial" w:hAnsi="Arial" w:cs="Arial"/>
+                <w:sz w:val="20"/>
+              </w:rPr>
+              <w:t>/</w:t>
+            </w:r>
+            <w:r>
+              <w:rPr>
+                <w:rFonts w:ascii="Arial" w:hAnsi="Arial" w:cs="Arial"/>
+                <w:sz w:val="20"/>
+              </w:rPr>
+              <w:t xml:space="preserve"> </w:t>
+            </w:r>
+            <w:r>
+              <w:rPr>
+                <w:rFonts w:ascii="Arial" w:hAnsi="Arial" w:cs="Arial"/>
+                <w:sz w:val="20"/>
+              </w:rPr>
+              <w:t>Friendship-system</w:t>
             </w:r>
           </w:p>
         </w:tc>
@@ -836,6 +864,13 @@
                 <w:sz w:val="20"/>
               </w:rPr>
             </w:pPr>
+            <w:r>
+              <w:rPr>
+                <w:rFonts w:ascii="Arial" w:hAnsi="Arial" w:cs="Arial"/>
+                <w:sz w:val="20"/>
+              </w:rPr>
+              <w:t>20.05.2026</w:t>
+            </w:r>
           </w:p>
         </w:tc>
         <w:tc>
@@ -851,6 +886,13 @@
                 <w:sz w:val="20"/>
               </w:rPr>
             </w:pPr>
+            <w:r>
+              <w:rPr>
+                <w:rFonts w:ascii="Arial" w:hAnsi="Arial" w:cs="Arial"/>
+                <w:sz w:val="20"/>
+              </w:rPr>
+              <w:t>0.1</w:t>
+            </w:r>
           </w:p>
         </w:tc>
         <w:tc>
@@ -866,6 +908,27 @@
                 <w:sz w:val="20"/>
               </w:rPr>
             </w:pPr>
+            <w:r>
+              <w:rPr>
+                <w:rFonts w:ascii="Arial" w:hAnsi="Arial" w:cs="Arial"/>
+                <w:sz w:val="20"/>
+              </w:rPr>
+              <w:t xml:space="preserve">Hubs </w:t>
+            </w:r>
+            <w:r>
+              <w:rPr>
+                <w:rFonts w:ascii="Arial" w:hAnsi="Arial" w:cs="Arial"/>
+                <w:sz w:val="20"/>
+              </w:rPr>
+              <w:t>/ ChatController</w:t>
+            </w:r>
+            <w:r>
+              <w:rPr>
+                <w:rFonts w:ascii="Arial" w:hAnsi="Arial" w:cs="Arial"/>
+                <w:sz w:val="20"/>
+              </w:rPr>
+              <w:t xml:space="preserve"> / WorkspaceController </w:t>
+            </w:r>
           </w:p>
         </w:tc>
         <w:tc>
@@ -881,6 +944,13 @@
                 <w:sz w:val="20"/>
               </w:rPr>
             </w:pPr>
+            <w:r>
+              <w:rPr>
+                <w:rFonts w:ascii="Arial" w:hAnsi="Arial" w:cs="Arial"/>
+                <w:sz w:val="20"/>
+              </w:rPr>
+              <w:t>Implementation</w:t>
+            </w:r>
           </w:p>
         </w:tc>
         <w:tc>
@@ -918,6 +988,16 @@
                 <w:sz w:val="20"/>
               </w:rPr>
             </w:pPr>
+            <w:r>
+              <w:rPr>
+                <w:rFonts w:ascii="Arial" w:hAnsi="Arial" w:cs="Arial"/>
+                <w:b/>
+                <w:bCs/>
+                <w:color w:val="70AD47" w:themeColor="accent6"/>
+                <w:sz w:val="20"/>
+              </w:rPr>
+              <w:t>DONE</w:t>
+            </w:r>
           </w:p>
         </w:tc>
       </w:tr>
@@ -12369,6 +12449,9 @@
     </w:p>
     <w:p>
       <w:r>
+        <w:rPr>
+          <w:noProof/>
+        </w:rPr>
         <w:drawing>
           <wp:inline distT="0" distB="0" distL="0" distR="0" wp14:anchorId="59A4181B" wp14:editId="4DD1FABB">
             <wp:extent cx="7879991" cy="3697409"/>
@@ -12427,6 +12510,9 @@
     </w:p>
     <w:p>
       <w:r>
+        <w:rPr>
+          <w:noProof/>
+        </w:rPr>
         <w:drawing>
           <wp:inline distT="0" distB="0" distL="0" distR="0" wp14:anchorId="5C8C0E2B" wp14:editId="457C5DDA">
             <wp:extent cx="5760720" cy="3728720"/>
@@ -12476,6 +12562,9 @@
     <w:p/>
     <w:p>
       <w:r>
+        <w:rPr>
+          <w:noProof/>
+        </w:rPr>
         <w:drawing>
           <wp:inline distT="0" distB="0" distL="0" distR="0" wp14:anchorId="698299F2" wp14:editId="02514FB3">
             <wp:extent cx="5760720" cy="3460750"/>

</xml_diff>

<commit_message>
[STRUCT] Prepared Frontend layouts and groups for this app
</commit_message>
<xml_diff>
--- a/0_Documents/Pflichtenheft.docx
+++ b/0_Documents/Pflichtenheft.docx
@@ -1040,6 +1040,13 @@
                 <w:sz w:val="20"/>
               </w:rPr>
             </w:pPr>
+            <w:r>
+              <w:rPr>
+                <w:rFonts w:ascii="Arial" w:hAnsi="Arial" w:cs="Arial"/>
+                <w:sz w:val="20"/>
+              </w:rPr>
+              <w:t>21.05.2026</w:t>
+            </w:r>
           </w:p>
         </w:tc>
         <w:tc>
@@ -1055,6 +1062,13 @@
                 <w:sz w:val="20"/>
               </w:rPr>
             </w:pPr>
+            <w:r>
+              <w:rPr>
+                <w:rFonts w:ascii="Arial" w:hAnsi="Arial" w:cs="Arial"/>
+                <w:sz w:val="20"/>
+              </w:rPr>
+              <w:t>0.1</w:t>
+            </w:r>
           </w:p>
         </w:tc>
         <w:tc>
@@ -1070,6 +1084,27 @@
                 <w:sz w:val="20"/>
               </w:rPr>
             </w:pPr>
+            <w:r>
+              <w:rPr>
+                <w:rFonts w:ascii="Arial" w:hAnsi="Arial" w:cs="Arial"/>
+                <w:sz w:val="20"/>
+              </w:rPr>
+              <w:t>API-Services / Hooks f</w:t>
+            </w:r>
+            <w:r>
+              <w:rPr>
+                <w:rFonts w:ascii="Arial" w:hAnsi="Arial" w:cs="Arial"/>
+                <w:sz w:val="20"/>
+              </w:rPr>
+              <w:t>ür</w:t>
+            </w:r>
+            <w:r>
+              <w:rPr>
+                <w:rFonts w:ascii="Arial" w:hAnsi="Arial" w:cs="Arial"/>
+                <w:sz w:val="20"/>
+              </w:rPr>
+              <w:t xml:space="preserve"> Hubs</w:t>
+            </w:r>
           </w:p>
         </w:tc>
         <w:tc>
@@ -1085,6 +1120,13 @@
                 <w:sz w:val="20"/>
               </w:rPr>
             </w:pPr>
+            <w:r>
+              <w:rPr>
+                <w:rFonts w:ascii="Arial" w:hAnsi="Arial" w:cs="Arial"/>
+                <w:sz w:val="20"/>
+              </w:rPr>
+              <w:t>Implementation</w:t>
+            </w:r>
           </w:p>
         </w:tc>
         <w:tc>
@@ -1122,6 +1164,16 @@
                 <w:sz w:val="20"/>
               </w:rPr>
             </w:pPr>
+            <w:r>
+              <w:rPr>
+                <w:rFonts w:ascii="Arial" w:hAnsi="Arial" w:cs="Arial"/>
+                <w:b/>
+                <w:bCs/>
+                <w:color w:val="70AD47" w:themeColor="accent6"/>
+                <w:sz w:val="20"/>
+              </w:rPr>
+              <w:t>DONE</w:t>
+            </w:r>
           </w:p>
         </w:tc>
       </w:tr>

</xml_diff>